<commit_message>
Add temporary files and initial document structure for "About Project" documentation - Added Inititial Notes regarding Project Brief and Research in .docx file - Added a Initially Planned detailed README file
</commit_message>
<xml_diff>
--- a/Notes About Project.docx
+++ b/Notes About Project.docx
@@ -400,8 +400,165 @@
       <w:r>
         <w:tab/>
       </w:r>
+    </w:p>
+    <w:p>
+      <w:pPr>
+        <w:spacing w:before="240"/>
+      </w:pPr>
+    </w:p>
+    <w:p>
+      <w:pPr>
+        <w:spacing w:before="240"/>
+      </w:pPr>
+      <w:r>
+        <w:lastRenderedPageBreak/>
+        <w:t>Workflow:</w:t>
+      </w:r>
+    </w:p>
+    <w:p>
+      <w:pPr>
+        <w:pStyle w:val="ListParagraph"/>
+        <w:numPr>
+          <w:ilvl w:val="0"/>
+          <w:numId w:val="2"/>
+        </w:numPr>
+        <w:spacing w:before="240"/>
+      </w:pPr>
+      <w:r>
+        <w:t xml:space="preserve">Input given is Primary JSON + Document Stored (if any – could be pdfs, docx, xlsx – can be over 100 pages and contain a lot of boilerplate stuff) </w:t>
+      </w:r>
+    </w:p>
+    <w:p>
+      <w:pPr>
+        <w:pStyle w:val="ListParagraph"/>
+        <w:numPr>
+          <w:ilvl w:val="1"/>
+          <w:numId w:val="2"/>
+        </w:numPr>
+        <w:spacing w:before="240"/>
+      </w:pPr>
+      <w:r>
+        <w:t xml:space="preserve">Key Issue: Unable to feed 100+ pages of raw text into </w:t>
+      </w:r>
+      <w:proofErr w:type="gramStart"/>
+      <w:r>
+        <w:t>a</w:t>
+      </w:r>
+      <w:proofErr w:type="gramEnd"/>
+      <w:r>
+        <w:t xml:space="preserve"> LLM without reaching serverless execution timeouts and dealing with massive latency and token cost.</w:t>
+      </w:r>
+    </w:p>
+    <w:p>
+      <w:pPr>
+        <w:pStyle w:val="ListParagraph"/>
+        <w:numPr>
+          <w:ilvl w:val="1"/>
+          <w:numId w:val="2"/>
+        </w:numPr>
+        <w:spacing w:before="240"/>
+      </w:pPr>
+      <w:r>
+        <w:t xml:space="preserve">Planned Solution: Implement a filtering/retrieval strategy like targeted section extraction/ semantic chunking / map-reduce summary extraction or </w:t>
+      </w:r>
+      <w:r>
+        <w:rPr>
+          <w:b/>
+          <w:bCs/>
+          <w:i/>
+          <w:iCs/>
+        </w:rPr>
+        <w:t>maybe</w:t>
+      </w:r>
+      <w:r>
+        <w:t xml:space="preserve"> </w:t>
+      </w:r>
       <w:bookmarkStart w:id="0" w:name="_GoBack"/>
       <w:bookmarkEnd w:id="0"/>
+    </w:p>
+    <w:p>
+      <w:pPr>
+        <w:pStyle w:val="ListParagraph"/>
+        <w:numPr>
+          <w:ilvl w:val="0"/>
+          <w:numId w:val="2"/>
+        </w:numPr>
+        <w:spacing w:before="240"/>
+      </w:pPr>
+      <w:r>
+        <w:rPr>
+          <w:b/>
+          <w:bCs/>
+        </w:rPr>
+        <w:t>Ingestion &amp; Extraction</w:t>
+      </w:r>
+      <w:r>
+        <w:t>: (Filter out noise, parse the documents (if any), extract key info)</w:t>
+      </w:r>
+    </w:p>
+    <w:p>
+      <w:pPr>
+        <w:pStyle w:val="ListParagraph"/>
+        <w:numPr>
+          <w:ilvl w:val="0"/>
+          <w:numId w:val="2"/>
+        </w:numPr>
+        <w:spacing w:before="240"/>
+        <w:rPr>
+          <w:b/>
+          <w:bCs/>
+        </w:rPr>
+      </w:pPr>
+      <w:r>
+        <w:rPr>
+          <w:b/>
+          <w:bCs/>
+        </w:rPr>
+        <w:t>Reasoning &amp; Risk Scoring:</w:t>
+      </w:r>
+      <w:r>
+        <w:t xml:space="preserve"> LLM’s Evaluation + deterministic scoring rules</w:t>
+      </w:r>
+    </w:p>
+    <w:p>
+      <w:pPr>
+        <w:pStyle w:val="ListParagraph"/>
+        <w:numPr>
+          <w:ilvl w:val="0"/>
+          <w:numId w:val="2"/>
+        </w:numPr>
+        <w:spacing w:before="240"/>
+        <w:rPr>
+          <w:b/>
+          <w:bCs/>
+        </w:rPr>
+      </w:pPr>
+      <w:r>
+        <w:rPr>
+          <w:b/>
+          <w:bCs/>
+        </w:rPr>
+        <w:t xml:space="preserve">Synthesis &amp; Orchestration: </w:t>
+      </w:r>
+      <w:r>
+        <w:t>Composite Scoring, Authorization Tier, Follow-up flags</w:t>
+      </w:r>
+    </w:p>
+    <w:p>
+      <w:pPr>
+        <w:pStyle w:val="ListParagraph"/>
+        <w:numPr>
+          <w:ilvl w:val="0"/>
+          <w:numId w:val="2"/>
+        </w:numPr>
+        <w:spacing w:before="240"/>
+      </w:pPr>
+      <w:r>
+        <w:t>Output</w:t>
+      </w:r>
+      <w:r>
+        <w:t>: Structured Payload given to Human Reviewer or External Review API/Webhook</w:t>
+      </w:r>
     </w:p>
     <w:sectPr>
       <w:pgSz w:w="12240" w:h="15840"/>
@@ -527,8 +684,100 @@
       </w:rPr>
     </w:lvl>
   </w:abstractNum>
+  <w:abstractNum w:abstractNumId="1" w15:restartNumberingAfterBreak="0">
+    <w:nsid w:val="5D74746B"/>
+    <w:multiLevelType w:val="hybridMultilevel"/>
+    <w:tmpl w:val="00F61E18"/>
+    <w:lvl w:ilvl="0" w:tplc="0409000F">
+      <w:start w:val="1"/>
+      <w:numFmt w:val="decimal"/>
+      <w:lvlText w:val="%1."/>
+      <w:lvlJc w:val="left"/>
+      <w:pPr>
+        <w:ind w:left="720" w:hanging="360"/>
+      </w:pPr>
+      <w:rPr>
+        <w:rFonts w:hint="default"/>
+      </w:rPr>
+    </w:lvl>
+    <w:lvl w:ilvl="1" w:tplc="04090019">
+      <w:start w:val="1"/>
+      <w:numFmt w:val="lowerLetter"/>
+      <w:lvlText w:val="%2."/>
+      <w:lvlJc w:val="left"/>
+      <w:pPr>
+        <w:ind w:left="1440" w:hanging="360"/>
+      </w:pPr>
+    </w:lvl>
+    <w:lvl w:ilvl="2" w:tplc="0409001B" w:tentative="1">
+      <w:start w:val="1"/>
+      <w:numFmt w:val="lowerRoman"/>
+      <w:lvlText w:val="%3."/>
+      <w:lvlJc w:val="right"/>
+      <w:pPr>
+        <w:ind w:left="2160" w:hanging="180"/>
+      </w:pPr>
+    </w:lvl>
+    <w:lvl w:ilvl="3" w:tplc="0409000F" w:tentative="1">
+      <w:start w:val="1"/>
+      <w:numFmt w:val="decimal"/>
+      <w:lvlText w:val="%4."/>
+      <w:lvlJc w:val="left"/>
+      <w:pPr>
+        <w:ind w:left="2880" w:hanging="360"/>
+      </w:pPr>
+    </w:lvl>
+    <w:lvl w:ilvl="4" w:tplc="04090019" w:tentative="1">
+      <w:start w:val="1"/>
+      <w:numFmt w:val="lowerLetter"/>
+      <w:lvlText w:val="%5."/>
+      <w:lvlJc w:val="left"/>
+      <w:pPr>
+        <w:ind w:left="3600" w:hanging="360"/>
+      </w:pPr>
+    </w:lvl>
+    <w:lvl w:ilvl="5" w:tplc="0409001B" w:tentative="1">
+      <w:start w:val="1"/>
+      <w:numFmt w:val="lowerRoman"/>
+      <w:lvlText w:val="%6."/>
+      <w:lvlJc w:val="right"/>
+      <w:pPr>
+        <w:ind w:left="4320" w:hanging="180"/>
+      </w:pPr>
+    </w:lvl>
+    <w:lvl w:ilvl="6" w:tplc="0409000F" w:tentative="1">
+      <w:start w:val="1"/>
+      <w:numFmt w:val="decimal"/>
+      <w:lvlText w:val="%7."/>
+      <w:lvlJc w:val="left"/>
+      <w:pPr>
+        <w:ind w:left="5040" w:hanging="360"/>
+      </w:pPr>
+    </w:lvl>
+    <w:lvl w:ilvl="7" w:tplc="04090019" w:tentative="1">
+      <w:start w:val="1"/>
+      <w:numFmt w:val="lowerLetter"/>
+      <w:lvlText w:val="%8."/>
+      <w:lvlJc w:val="left"/>
+      <w:pPr>
+        <w:ind w:left="5760" w:hanging="360"/>
+      </w:pPr>
+    </w:lvl>
+    <w:lvl w:ilvl="8" w:tplc="0409001B" w:tentative="1">
+      <w:start w:val="1"/>
+      <w:numFmt w:val="lowerRoman"/>
+      <w:lvlText w:val="%9."/>
+      <w:lvlJc w:val="right"/>
+      <w:pPr>
+        <w:ind w:left="6480" w:hanging="180"/>
+      </w:pPr>
+    </w:lvl>
+  </w:abstractNum>
   <w:num w:numId="1">
     <w:abstractNumId w:val="0"/>
+  </w:num>
+  <w:num w:numId="2">
+    <w:abstractNumId w:val="1"/>
   </w:num>
 </w:numbering>
 </file>

</xml_diff>

<commit_message>
docs: clarify parser logic and record ideas
- Clarify regex pattern and extraction comments
- Added new planned ideas and corrections to be implemented in "Notes About Project.docx"
</commit_message>
<xml_diff>
--- a/Notes About Project.docx
+++ b/Notes About Project.docx
@@ -3,6 +3,415 @@
 <w:document xmlns:wpc="http://schemas.microsoft.com/office/word/2010/wordprocessingCanvas" xmlns:cx="http://schemas.microsoft.com/office/drawing/2014/chartex" xmlns:cx1="http://schemas.microsoft.com/office/drawing/2015/9/8/chartex" xmlns:cx2="http://schemas.microsoft.com/office/drawing/2015/10/21/chartex" xmlns:cx3="http://schemas.microsoft.com/office/drawing/2016/5/9/chartex" xmlns:cx4="http://schemas.microsoft.com/office/drawing/2016/5/10/chartex" xmlns:cx5="http://schemas.microsoft.com/office/drawing/2016/5/11/chartex" xmlns:cx6="http://schemas.microsoft.com/office/drawing/2016/5/12/chartex" xmlns:cx7="http://schemas.microsoft.com/office/drawing/2016/5/13/chartex" xmlns:cx8="http://schemas.microsoft.com/office/drawing/2016/5/14/chartex" xmlns:mc="http://schemas.openxmlformats.org/markup-compatibility/2006" xmlns:aink="http://schemas.microsoft.com/office/drawing/2016/ink" xmlns:am3d="http://schemas.microsoft.com/office/drawing/2017/model3d" xmlns:o="urn:schemas-microsoft-com:office:office" xmlns:r="http://schemas.openxmlformats.org/officeDocument/2006/relationships" xmlns:m="http://schemas.openxmlformats.org/officeDocument/2006/math" xmlns:v="urn:schemas-microsoft-com:vml" xmlns:wp14="http://schemas.microsoft.com/office/word/2010/wordprocessingDrawing" xmlns:wp="http://schemas.openxmlformats.org/drawingml/2006/wordprocessingDrawing" xmlns:w10="urn:schemas-microsoft-com:office:word" xmlns:w="http://schemas.openxmlformats.org/wordprocessingml/2006/main" xmlns:w14="http://schemas.microsoft.com/office/word/2010/wordml" xmlns:w15="http://schemas.microsoft.com/office/word/2012/wordml" xmlns:w16cex="http://schemas.microsoft.com/office/word/2018/wordml/cex" xmlns:w16cid="http://schemas.microsoft.com/office/word/2016/wordml/cid" xmlns:w16="http://schemas.microsoft.com/office/word/2018/wordml" xmlns:w16se="http://schemas.microsoft.com/office/word/2015/wordml/symex" xmlns:wpg="http://schemas.microsoft.com/office/word/2010/wordprocessingGroup" xmlns:wpi="http://schemas.microsoft.com/office/word/2010/wordprocessingInk" xmlns:wne="http://schemas.microsoft.com/office/word/2006/wordml" xmlns:wps="http://schemas.microsoft.com/office/word/2010/wordprocessingShape" mc:Ignorable="w14 w15 w16se w16cid w16 w16cex wp14">
   <w:body>
     <w:p>
+      <w:pPr>
+        <w:rPr>
+          <w:b/>
+          <w:bCs/>
+          <w:sz w:val="32"/>
+          <w:szCs w:val="32"/>
+          <w:u w:val="single"/>
+        </w:rPr>
+      </w:pPr>
+      <w:r>
+        <w:rPr>
+          <w:b/>
+          <w:bCs/>
+          <w:sz w:val="32"/>
+          <w:szCs w:val="32"/>
+          <w:u w:val="single"/>
+        </w:rPr>
+        <w:t>Improvements/Further Thoughts:</w:t>
+      </w:r>
+    </w:p>
+    <w:p>
+      <w:pPr>
+        <w:pStyle w:val="ListParagraph"/>
+        <w:numPr>
+          <w:ilvl w:val="0"/>
+          <w:numId w:val="3"/>
+        </w:numPr>
+        <w:rPr>
+          <w:b/>
+          <w:bCs/>
+          <w:sz w:val="32"/>
+          <w:szCs w:val="32"/>
+          <w:u w:val="single"/>
+        </w:rPr>
+      </w:pPr>
+      <w:r>
+        <w:t xml:space="preserve">Solve AFC error being shown in terminal </w:t>
+      </w:r>
+      <w:r>
+        <w:t>for the gemini thingy or something</w:t>
+      </w:r>
+      <w:bookmarkStart w:id="0" w:name="_GoBack"/>
+      <w:bookmarkEnd w:id="0"/>
+    </w:p>
+    <w:p>
+      <w:pPr>
+        <w:pStyle w:val="ListParagraph"/>
+        <w:numPr>
+          <w:ilvl w:val="0"/>
+          <w:numId w:val="3"/>
+        </w:numPr>
+        <w:rPr>
+          <w:b/>
+          <w:bCs/>
+          <w:sz w:val="32"/>
+          <w:szCs w:val="32"/>
+          <w:u w:val="single"/>
+        </w:rPr>
+      </w:pPr>
+      <w:r>
+        <w:t xml:space="preserve">Should this pipeline be given a UI which shows everything or not since by giving the UI it could help to present to the normal non-technical stakeholders too how it works etc rather than just the technical stakeholders possibly and also UI in such a way that the backend still exists and visible easily </w:t>
+      </w:r>
+      <w:r>
+        <w:rPr>
+          <w:b/>
+          <w:bCs/>
+        </w:rPr>
+        <w:t xml:space="preserve">BUT NOT SURE NEED TO CONFIRM IF </w:t>
+      </w:r>
+      <w:r>
+        <w:rPr>
+          <w:b/>
+          <w:bCs/>
+        </w:rPr>
+        <w:t>SUITABLE FOR PIPELINE OR NOT</w:t>
+      </w:r>
+      <w:r>
+        <w:t xml:space="preserve"> as we’re already using docker so like can contain all this in a container like packaged in a way</w:t>
+      </w:r>
+    </w:p>
+    <w:p>
+      <w:pPr>
+        <w:pStyle w:val="ListParagraph"/>
+        <w:numPr>
+          <w:ilvl w:val="0"/>
+          <w:numId w:val="3"/>
+        </w:numPr>
+        <w:rPr>
+          <w:b/>
+          <w:bCs/>
+          <w:sz w:val="32"/>
+          <w:szCs w:val="32"/>
+          <w:u w:val="single"/>
+        </w:rPr>
+      </w:pPr>
+      <w:r>
+        <w:t>For the API reviewer endpoint possibly get like UI for that if possible this would again help in this case for both the non-technical audience and technical audience to understand it</w:t>
+      </w:r>
+    </w:p>
+    <w:p>
+      <w:pPr>
+        <w:pStyle w:val="ListParagraph"/>
+        <w:rPr>
+          <w:b/>
+          <w:bCs/>
+        </w:rPr>
+      </w:pPr>
+    </w:p>
+    <w:p>
+      <w:pPr>
+        <w:pStyle w:val="ListParagraph"/>
+        <w:rPr>
+          <w:b/>
+          <w:bCs/>
+          <w:sz w:val="32"/>
+          <w:szCs w:val="32"/>
+          <w:u w:val="single"/>
+        </w:rPr>
+      </w:pPr>
+      <w:r>
+        <w:rPr>
+          <w:b/>
+          <w:bCs/>
+        </w:rPr>
+        <w:t>NOTE: TRY USING AI TOOLS LIKE SPARK OR SOMETHING FOR PROTOTYPING THE ABOVE</w:t>
+      </w:r>
+    </w:p>
+    <w:p>
+      <w:pPr>
+        <w:pStyle w:val="ListParagraph"/>
+      </w:pPr>
+    </w:p>
+    <w:p>
+      <w:pPr>
+        <w:pStyle w:val="ListParagraph"/>
+        <w:numPr>
+          <w:ilvl w:val="0"/>
+          <w:numId w:val="3"/>
+        </w:numPr>
+      </w:pPr>
+      <w:r>
+        <w:t>Possibly having a bit flexible applicant metadata of some form or something since dealing with different organizations perhaps or something?</w:t>
+      </w:r>
+    </w:p>
+    <w:p>
+      <w:pPr>
+        <w:pStyle w:val="ListParagraph"/>
+        <w:numPr>
+          <w:ilvl w:val="0"/>
+          <w:numId w:val="3"/>
+        </w:numPr>
+      </w:pPr>
+      <w:r>
+        <w:t>Search up projects or pipelines similar to this online and possible real-world applications or real companies operating on a structure like this or something maybe to check if urs is almost or nearly equivalent to theirs</w:t>
+      </w:r>
+    </w:p>
+    <w:p>
+      <w:pPr>
+        <w:pStyle w:val="ListParagraph"/>
+        <w:numPr>
+          <w:ilvl w:val="0"/>
+          <w:numId w:val="3"/>
+        </w:numPr>
+      </w:pPr>
+      <w:r>
+        <w:t>Rather than fetching only one file related to coinbase how about finding a AWS bucket or GCS (google) bucket which has a bunch of docs like this cuz I believe in case of audits there could be like a single company applicant having various applications in various sectors let’s say financial, digital infrastructure, governmental contracts and so on (if this is actually the case or not feel free to disagree on this if I’m wrong)</w:t>
+      </w:r>
+    </w:p>
+    <w:p>
+      <w:pPr>
+        <w:pStyle w:val="ListParagraph"/>
+        <w:numPr>
+          <w:ilvl w:val="0"/>
+          <w:numId w:val="3"/>
+        </w:numPr>
+      </w:pPr>
+      <w:r>
+        <w:rPr>
+          <w:b/>
+          <w:bCs/>
+          <w:i/>
+          <w:iCs/>
+        </w:rPr>
+        <w:t>Parser.py</w:t>
+      </w:r>
+      <w:r>
+        <w:t xml:space="preserve">: </w:t>
+      </w:r>
+      <w:r>
+        <w:t>if not matches:</w:t>
+      </w:r>
+      <w:r>
+        <w:t xml:space="preserve"> </w:t>
+      </w:r>
+    </w:p>
+    <w:p>
+      <w:pPr>
+        <w:pStyle w:val="ListParagraph"/>
+      </w:pPr>
+      <w:r>
+        <w:t>            logger.warning("Regex failed to find Item 1A and 1B markers. Falling back to naive chunking.")</w:t>
+      </w:r>
+    </w:p>
+    <w:p>
+      <w:pPr>
+        <w:pStyle w:val="ListParagraph"/>
+      </w:pPr>
+      <w:r>
+        <w:t>            # Fallback: Just return the first 20,000 characters if regex fails</w:t>
+      </w:r>
+    </w:p>
+    <w:p>
+      <w:pPr>
+        <w:pStyle w:val="ListParagraph"/>
+      </w:pPr>
+      <w:r>
+        <w:t>            return text[:20000]</w:t>
+      </w:r>
+    </w:p>
+    <w:p>
+      <w:pPr>
+        <w:pStyle w:val="ListParagraph"/>
+      </w:pPr>
+    </w:p>
+    <w:p>
+      <w:pPr>
+        <w:pStyle w:val="ListParagraph"/>
+      </w:pPr>
+      <w:r>
+        <w:t>^^^^ (how about not falling back to naïve chunking and simply outputting a error and flagging this for further review than wasting LLM tokens and resources unnecessarily and passing it further down pipeline causing more errors later on for the human reviewer)</w:t>
+      </w:r>
+    </w:p>
+    <w:p>
+      <w:pPr>
+        <w:pStyle w:val="ListParagraph"/>
+        <w:numPr>
+          <w:ilvl w:val="0"/>
+          <w:numId w:val="3"/>
+        </w:numPr>
+        <w:rPr>
+          <w:i/>
+          <w:iCs/>
+        </w:rPr>
+      </w:pPr>
+      <w:r>
+        <w:rPr>
+          <w:b/>
+          <w:bCs/>
+          <w:i/>
+          <w:iCs/>
+        </w:rPr>
+        <w:t>Parser.py:</w:t>
+      </w:r>
+      <w:r>
+        <w:rPr>
+          <w:rFonts w:ascii="Consolas" w:eastAsia="Times New Roman" w:hAnsi="Consolas" w:cs="Times New Roman"/>
+          <w:color w:val="D4D4D4"/>
+          <w:sz w:val="21"/>
+          <w:szCs w:val="21"/>
+        </w:rPr>
+        <w:t xml:space="preserve"> </w:t>
+      </w:r>
+      <w:r>
+        <w:rPr>
+          <w:i/>
+          <w:iCs/>
+        </w:rPr>
+        <w:t xml:space="preserve">max_chars = 60000 </w:t>
+      </w:r>
+    </w:p>
+    <w:p>
+      <w:pPr>
+        <w:pStyle w:val="ListParagraph"/>
+        <w:rPr>
+          <w:i/>
+          <w:iCs/>
+        </w:rPr>
+      </w:pPr>
+      <w:r>
+        <w:rPr>
+          <w:i/>
+          <w:iCs/>
+        </w:rPr>
+        <w:t>       if len(extracted_text) &gt; max_chars:</w:t>
+      </w:r>
+    </w:p>
+    <w:p>
+      <w:pPr>
+        <w:pStyle w:val="ListParagraph"/>
+        <w:rPr>
+          <w:i/>
+          <w:iCs/>
+        </w:rPr>
+      </w:pPr>
+      <w:r>
+        <w:rPr>
+          <w:i/>
+          <w:iCs/>
+        </w:rPr>
+        <w:t>            logger.info(f"Truncating extraction from {len(extracted_text)} to {max_chars} characters for token efficiency.")</w:t>
+      </w:r>
+    </w:p>
+    <w:p>
+      <w:pPr>
+        <w:pStyle w:val="ListParagraph"/>
+        <w:rPr>
+          <w:i/>
+          <w:iCs/>
+        </w:rPr>
+      </w:pPr>
+      <w:r>
+        <w:rPr>
+          <w:i/>
+          <w:iCs/>
+        </w:rPr>
+        <w:t>            extracted_text = extracted_text[:max_chars]</w:t>
+      </w:r>
+    </w:p>
+    <w:p>
+      <w:pPr>
+        <w:pStyle w:val="ListParagraph"/>
+        <w:rPr>
+          <w:i/>
+          <w:iCs/>
+        </w:rPr>
+      </w:pPr>
+      <w:r>
+        <w:rPr>
+          <w:i/>
+          <w:iCs/>
+        </w:rPr>
+        <w:t xml:space="preserve">            </w:t>
+      </w:r>
+    </w:p>
+    <w:p>
+      <w:pPr>
+        <w:pStyle w:val="ListParagraph"/>
+        <w:rPr>
+          <w:i/>
+          <w:iCs/>
+        </w:rPr>
+      </w:pPr>
+      <w:r>
+        <w:rPr>
+          <w:i/>
+          <w:iCs/>
+        </w:rPr>
+        <w:t>        return extracted_text</w:t>
+      </w:r>
+    </w:p>
+    <w:p>
+      <w:pPr>
+        <w:pStyle w:val="ListParagraph"/>
+      </w:pPr>
+      <w:r>
+        <w:t xml:space="preserve">^^^ (If we’re just truncating randomly this could risk leaving out important details no? so how about using semantic ranking technique like TF-IDF or BN25 or something like that not suer if they are applicable in our case but something like that allowing us to rank whole sentences or just select most heavy or u know context heavy words from the sentences and then ranking the </w:t>
+      </w:r>
+      <w:r>
+        <w:lastRenderedPageBreak/>
+        <w:t>whole sentences accordingly to get the most context in hence allowing earlier truncation as well making the pipeline more efficient this way as well as also leaving out the possibility of leaving out info through random truncation) (ALSO configure like check what context window our current model operates on and secondly if it’s a static context window or a dynamic window and then accordingly set the truncation size if we still need to truncate.)</w:t>
+      </w:r>
+    </w:p>
+    <w:p>
+      <w:pPr>
+        <w:pStyle w:val="ListParagraph"/>
+      </w:pPr>
+      <w:r>
+        <w:t xml:space="preserve"> </w:t>
+      </w:r>
+    </w:p>
+    <w:p>
+      <w:pPr>
+        <w:pStyle w:val="ListParagraph"/>
+      </w:pPr>
+      <w:r>
+        <w:t>^^^^ Another Idea for this: Another idea is that in case the text is extremely long then how about taking a efficient approach for this where the less complex things can be provided to a far cheaper LLM model that takes up less cost and the complex or the end high level decisions with the relevant context can be provide to a LLM which can  take up less cost but will only be reasoning rather than inferring as well which the cheaper LLM already does hence overall technically should spend less resources on LLM</w:t>
+      </w:r>
+      <w:r>
+        <w:t xml:space="preserve"> </w:t>
+      </w:r>
+      <w:r>
+        <w:rPr>
+          <w:b/>
+          <w:bCs/>
+        </w:rPr>
+        <w:t>HOWEVER</w:t>
+      </w:r>
+      <w:r>
+        <w:t xml:space="preserve"> we need to remain within the constraint of a fixed execution limit so need to keep that in mind when still deciding on how much time we’re taking specially to process the initial text and the semantically ranked text or something the way we’re gonna be proceeding basically)</w:t>
+      </w:r>
+    </w:p>
+    <w:p>
+      <w:pPr>
+        <w:pStyle w:val="ListParagraph"/>
+      </w:pPr>
+    </w:p>
+    <w:p>
+      <w:pPr>
+        <w:pStyle w:val="ListParagraph"/>
+        <w:numPr>
+          <w:ilvl w:val="0"/>
+          <w:numId w:val="3"/>
+        </w:numPr>
+      </w:pPr>
+    </w:p>
+    <w:p/>
+    <w:p/>
+    <w:p/>
+    <w:p>
       <w:r>
         <w:t>Fundamentals of AI Engineering:</w:t>
       </w:r>
@@ -82,23 +491,7 @@
         </w:numPr>
       </w:pPr>
       <w:r>
-        <w:t xml:space="preserve">Agentic Workflows: Designing AI systems that can plan tasks, use external </w:t>
-      </w:r>
-      <w:proofErr w:type="gramStart"/>
-      <w:r>
-        <w:t>tools(</w:t>
-      </w:r>
-      <w:proofErr w:type="gramEnd"/>
-      <w:r>
-        <w:t xml:space="preserve">searching web </w:t>
-      </w:r>
-      <w:proofErr w:type="spellStart"/>
-      <w:r>
-        <w:t>e..g</w:t>
-      </w:r>
-      <w:proofErr w:type="spellEnd"/>
-      <w:r>
-        <w:t>) and self-correct errors.</w:t>
+        <w:t>Agentic Workflows: Designing AI systems that can plan tasks, use external tools(searching web e..g) and self-correct errors.</w:t>
       </w:r>
     </w:p>
     <w:p>
@@ -113,23 +506,7 @@
         <w:t>Chaining &amp; State Management:</w:t>
       </w:r>
       <w:r>
-        <w:t xml:space="preserve"> Sequencing multiple model calls together using frameworks like </w:t>
-      </w:r>
-      <w:proofErr w:type="spellStart"/>
-      <w:r>
-        <w:t>LangChain</w:t>
-      </w:r>
-      <w:proofErr w:type="spellEnd"/>
-      <w:r>
-        <w:t xml:space="preserve"> or </w:t>
-      </w:r>
-      <w:proofErr w:type="spellStart"/>
-      <w:r>
-        <w:t>LlamaIndex</w:t>
-      </w:r>
-      <w:proofErr w:type="spellEnd"/>
-      <w:r>
-        <w:t xml:space="preserve"> while maintaining context of user convo.</w:t>
+        <w:t xml:space="preserve"> Sequencing multiple model calls together using frameworks like LangChain or LlamaIndex while maintaining context of user convo.</w:t>
       </w:r>
     </w:p>
     <w:p>
@@ -152,19 +529,9 @@
           <w:numId w:val="1"/>
         </w:numPr>
       </w:pPr>
-      <w:proofErr w:type="spellStart"/>
-      <w:r>
-        <w:t>MLOps</w:t>
-      </w:r>
-      <w:proofErr w:type="spellEnd"/>
-      <w:r>
-        <w:t xml:space="preserve"> and </w:t>
-      </w:r>
-      <w:proofErr w:type="spellStart"/>
-      <w:r>
-        <w:t>LLMOps</w:t>
-      </w:r>
-      <w:proofErr w:type="spellEnd"/>
+      <w:r>
+        <w:t>MLOps and LLMOps</w:t>
+      </w:r>
     </w:p>
     <w:p>
       <w:pPr>
@@ -187,35 +554,20 @@
         </w:numPr>
       </w:pPr>
       <w:r>
-        <w:t xml:space="preserve">Production Monitoring: Setting up real-time </w:t>
-      </w:r>
-      <w:proofErr w:type="spellStart"/>
-      <w:r>
-        <w:t>alterts</w:t>
-      </w:r>
-      <w:proofErr w:type="spellEnd"/>
-      <w:r>
-        <w:t>- monitor system health, cost anomalies, data drift (real-world data changes from original training/testing data of model)</w:t>
-      </w:r>
-    </w:p>
-    <w:p>
-      <w:pPr>
-        <w:pStyle w:val="ListParagraph"/>
-        <w:numPr>
-          <w:ilvl w:val="1"/>
-          <w:numId w:val="1"/>
-        </w:numPr>
-      </w:pPr>
-      <w:r>
-        <w:t>Guardrails &amp; Security: Implementing runtime validation layers (</w:t>
-      </w:r>
-      <w:proofErr w:type="spellStart"/>
-      <w:r>
-        <w:t>NeMo</w:t>
-      </w:r>
-      <w:proofErr w:type="spellEnd"/>
-      <w:r>
-        <w:t xml:space="preserve"> Guardrails/Llama Guard) – filters out prompt injection attacks/malicious inputs before reaching model</w:t>
+        <w:t>Production Monitoring: Setting up real-time alterts- monitor system health, cost anomalies, data drift (real-world data changes from original training/testing data of model)</w:t>
+      </w:r>
+    </w:p>
+    <w:p>
+      <w:pPr>
+        <w:pStyle w:val="ListParagraph"/>
+        <w:numPr>
+          <w:ilvl w:val="1"/>
+          <w:numId w:val="1"/>
+        </w:numPr>
+      </w:pPr>
+      <w:r>
+        <w:lastRenderedPageBreak/>
+        <w:t>Guardrails &amp; Security: Implementing runtime validation layers (NeMo Guardrails/Llama Guard) – filters out prompt injection attacks/malicious inputs before reaching model</w:t>
       </w:r>
     </w:p>
     <w:p>
@@ -242,23 +594,7 @@
         </w:numPr>
       </w:pPr>
       <w:r>
-        <w:t xml:space="preserve">Performance </w:t>
-      </w:r>
-      <w:proofErr w:type="spellStart"/>
-      <w:r>
-        <w:t>Metricss</w:t>
-      </w:r>
-      <w:proofErr w:type="spellEnd"/>
-      <w:r>
-        <w:t xml:space="preserve">: Measures correctness using standard metrics like precision, recall, and F1-score for traditional ML or semantic similarity and task success rates for </w:t>
-      </w:r>
-      <w:proofErr w:type="spellStart"/>
-      <w:r>
-        <w:t>GenAI</w:t>
-      </w:r>
-      <w:proofErr w:type="spellEnd"/>
-      <w:r>
-        <w:t>.</w:t>
+        <w:t>Performance Metricss: Measures correctness using standard metrics like precision, recall, and F1-score for traditional ML or semantic similarity and task success rates for GenAI.</w:t>
       </w:r>
     </w:p>
     <w:p>
@@ -411,7 +747,6 @@
         <w:spacing w:before="240"/>
       </w:pPr>
       <w:r>
-        <w:lastRenderedPageBreak/>
         <w:t>Workflow:</w:t>
       </w:r>
     </w:p>
@@ -438,15 +773,7 @@
         <w:spacing w:before="240"/>
       </w:pPr>
       <w:r>
-        <w:t xml:space="preserve">Key Issue: Unable to feed 100+ pages of raw text into </w:t>
-      </w:r>
-      <w:proofErr w:type="gramStart"/>
-      <w:r>
-        <w:t>a</w:t>
-      </w:r>
-      <w:proofErr w:type="gramEnd"/>
-      <w:r>
-        <w:t xml:space="preserve"> LLM without reaching serverless execution timeouts and dealing with massive latency and token cost.</w:t>
+        <w:t>Key Issue: Unable to feed 100+ pages of raw text into a LLM without reaching serverless execution timeouts and dealing with massive latency and token cost.</w:t>
       </w:r>
     </w:p>
     <w:p>
@@ -473,8 +800,6 @@
       <w:r>
         <w:t xml:space="preserve"> </w:t>
       </w:r>
-      <w:bookmarkStart w:id="0" w:name="_GoBack"/>
-      <w:bookmarkEnd w:id="0"/>
     </w:p>
     <w:p>
       <w:pPr>
@@ -558,6 +883,201 @@
       </w:r>
       <w:r>
         <w:t>: Structured Payload given to Human Reviewer or External Review API/Webhook</w:t>
+      </w:r>
+    </w:p>
+    <w:p>
+      <w:pPr>
+        <w:spacing w:before="240"/>
+      </w:pPr>
+    </w:p>
+    <w:p>
+      <w:pPr>
+        <w:spacing w:before="240"/>
+      </w:pPr>
+    </w:p>
+    <w:p>
+      <w:pPr>
+        <w:pStyle w:val="ListParagraph"/>
+        <w:numPr>
+          <w:ilvl w:val="0"/>
+          <w:numId w:val="1"/>
+        </w:numPr>
+        <w:spacing w:before="240"/>
+      </w:pPr>
+      <w:r>
+        <w:t>For Risk Assessment &amp; Dimension Scoring:</w:t>
+      </w:r>
+    </w:p>
+    <w:p>
+      <w:pPr>
+        <w:pStyle w:val="ListParagraph"/>
+        <w:numPr>
+          <w:ilvl w:val="1"/>
+          <w:numId w:val="1"/>
+        </w:numPr>
+        <w:spacing w:before="240"/>
+      </w:pPr>
+      <w:r>
+        <w:t xml:space="preserve">System evaluates application across fixed dimensions like: </w:t>
+      </w:r>
+      <w:r>
+        <w:rPr>
+          <w:b/>
+          <w:bCs/>
+        </w:rPr>
+        <w:t>Operational Resilience &amp; Infrastructure Risk</w:t>
+      </w:r>
+      <w:r>
+        <w:t xml:space="preserve"> (uptime, failover, disaster recovery, cloud security), </w:t>
+      </w:r>
+      <w:r>
+        <w:rPr>
+          <w:b/>
+          <w:bCs/>
+        </w:rPr>
+        <w:t>Regulatory &amp; Compliance Integrity</w:t>
+      </w:r>
+      <w:r>
+        <w:t xml:space="preserve"> (KYC Controls, licensing history, sanctions), </w:t>
+      </w:r>
+      <w:r>
+        <w:rPr>
+          <w:b/>
+          <w:bCs/>
+        </w:rPr>
+        <w:t xml:space="preserve">Financial Solvency &amp; </w:t>
+      </w:r>
+      <w:r>
+        <w:rPr>
+          <w:b/>
+          <w:bCs/>
+        </w:rPr>
+        <w:lastRenderedPageBreak/>
+        <w:t>Counterparty Risk</w:t>
+      </w:r>
+      <w:r>
+        <w:t xml:space="preserve"> (capital adequacy, liquidity, balance sheet, health), </w:t>
+      </w:r>
+      <w:r>
+        <w:rPr>
+          <w:b/>
+          <w:bCs/>
+        </w:rPr>
+        <w:t>Data Governance &amp; Security</w:t>
+      </w:r>
+      <w:r>
+        <w:t xml:space="preserve"> (encryption, access controls, data residency)</w:t>
+      </w:r>
+    </w:p>
+    <w:p>
+      <w:pPr>
+        <w:pStyle w:val="ListParagraph"/>
+        <w:numPr>
+          <w:ilvl w:val="2"/>
+          <w:numId w:val="1"/>
+        </w:numPr>
+        <w:spacing w:before="240"/>
+      </w:pPr>
+      <w:r>
+        <w:t xml:space="preserve">Separate risk rating (high, low etc.) for each dimension with </w:t>
+      </w:r>
+      <w:r>
+        <w:rPr>
+          <w:b/>
+          <w:bCs/>
+        </w:rPr>
+        <w:t>evidence</w:t>
+      </w:r>
+    </w:p>
+    <w:p>
+      <w:pPr>
+        <w:pStyle w:val="ListParagraph"/>
+        <w:numPr>
+          <w:ilvl w:val="2"/>
+          <w:numId w:val="1"/>
+        </w:numPr>
+        <w:spacing w:before="240"/>
+      </w:pPr>
+      <w:r>
+        <w:t>Mathematical composite score i.e. a weighted average to keep final score explainable.</w:t>
+      </w:r>
+    </w:p>
+    <w:p>
+      <w:pPr>
+        <w:pStyle w:val="ListParagraph"/>
+        <w:numPr>
+          <w:ilvl w:val="0"/>
+          <w:numId w:val="1"/>
+        </w:numPr>
+        <w:spacing w:before="240"/>
+      </w:pPr>
+      <w:r>
+        <w:t>Decision:</w:t>
+      </w:r>
+    </w:p>
+    <w:p>
+      <w:pPr>
+        <w:pStyle w:val="ListParagraph"/>
+        <w:numPr>
+          <w:ilvl w:val="1"/>
+          <w:numId w:val="1"/>
+        </w:numPr>
+        <w:spacing w:before="240"/>
+      </w:pPr>
+      <w:r>
+        <w:t>Based on the composite scores &amp; threshold rules, grant decision like Full Authorization, Require Supervisory Audit etc.</w:t>
+      </w:r>
+    </w:p>
+    <w:p>
+      <w:pPr>
+        <w:pStyle w:val="ListParagraph"/>
+        <w:numPr>
+          <w:ilvl w:val="1"/>
+          <w:numId w:val="1"/>
+        </w:numPr>
+        <w:spacing w:before="240"/>
+      </w:pPr>
+      <w:r>
+        <w:t>In case of missing info or contradicting info from JSON with the documents, follow-up questions asked from applicant.</w:t>
+      </w:r>
+    </w:p>
+    <w:p>
+      <w:pPr>
+        <w:pStyle w:val="ListParagraph"/>
+        <w:numPr>
+          <w:ilvl w:val="0"/>
+          <w:numId w:val="1"/>
+        </w:numPr>
+        <w:spacing w:before="240"/>
+      </w:pPr>
+      <w:r>
+        <w:t>Auditing:</w:t>
+      </w:r>
+    </w:p>
+    <w:p>
+      <w:pPr>
+        <w:pStyle w:val="ListParagraph"/>
+        <w:numPr>
+          <w:ilvl w:val="1"/>
+          <w:numId w:val="1"/>
+        </w:numPr>
+        <w:spacing w:before="240"/>
+      </w:pPr>
+      <w:r>
+        <w:t>Output Payload is against a strict set schema allowing human reviewer to ingest without being all over the place in diff schemas.</w:t>
+      </w:r>
+    </w:p>
+    <w:p>
+      <w:pPr>
+        <w:pStyle w:val="ListParagraph"/>
+        <w:numPr>
+          <w:ilvl w:val="1"/>
+          <w:numId w:val="1"/>
+        </w:numPr>
+        <w:spacing w:before="240"/>
+      </w:pPr>
+      <w:r>
+        <w:t>Final JSON delivered to a external review API endpoint. Every score traceable back to log traces and raw text evidence (allows human analyst to verify in case of risk-flagging).</w:t>
       </w:r>
     </w:p>
     <w:sectPr>
@@ -599,7 +1119,7 @@
         <w:rFonts w:ascii="Courier New" w:hAnsi="Courier New" w:cs="Courier New" w:hint="default"/>
       </w:rPr>
     </w:lvl>
-    <w:lvl w:ilvl="2" w:tplc="04090005" w:tentative="1">
+    <w:lvl w:ilvl="2" w:tplc="04090005">
       <w:start w:val="1"/>
       <w:numFmt w:val="bullet"/>
       <w:lvlText w:val=""/>
@@ -709,7 +1229,7 @@
         <w:ind w:left="1440" w:hanging="360"/>
       </w:pPr>
     </w:lvl>
-    <w:lvl w:ilvl="2" w:tplc="0409001B" w:tentative="1">
+    <w:lvl w:ilvl="2" w:tplc="0409001B">
       <w:start w:val="1"/>
       <w:numFmt w:val="lowerRoman"/>
       <w:lvlText w:val="%3."/>
@@ -718,7 +1238,7 @@
         <w:ind w:left="2160" w:hanging="180"/>
       </w:pPr>
     </w:lvl>
-    <w:lvl w:ilvl="3" w:tplc="0409000F" w:tentative="1">
+    <w:lvl w:ilvl="3" w:tplc="0409000F">
       <w:start w:val="1"/>
       <w:numFmt w:val="decimal"/>
       <w:lvlText w:val="%4."/>
@@ -771,6 +1291,119 @@
       <w:pPr>
         <w:ind w:left="6480" w:hanging="180"/>
       </w:pPr>
+    </w:lvl>
+  </w:abstractNum>
+  <w:abstractNum w:abstractNumId="2" w15:restartNumberingAfterBreak="0">
+    <w:nsid w:val="618445D6"/>
+    <w:multiLevelType w:val="hybridMultilevel"/>
+    <w:tmpl w:val="920AFF48"/>
+    <w:lvl w:ilvl="0" w:tplc="4252CBA8">
+      <w:start w:val="1"/>
+      <w:numFmt w:val="bullet"/>
+      <w:lvlText w:val="-"/>
+      <w:lvlJc w:val="left"/>
+      <w:pPr>
+        <w:ind w:left="720" w:hanging="360"/>
+      </w:pPr>
+      <w:rPr>
+        <w:rFonts w:ascii="Calibri" w:eastAsiaTheme="minorHAnsi" w:hAnsi="Calibri" w:cs="Calibri" w:hint="default"/>
+      </w:rPr>
+    </w:lvl>
+    <w:lvl w:ilvl="1" w:tplc="04090003" w:tentative="1">
+      <w:start w:val="1"/>
+      <w:numFmt w:val="bullet"/>
+      <w:lvlText w:val="o"/>
+      <w:lvlJc w:val="left"/>
+      <w:pPr>
+        <w:ind w:left="1440" w:hanging="360"/>
+      </w:pPr>
+      <w:rPr>
+        <w:rFonts w:ascii="Courier New" w:hAnsi="Courier New" w:cs="Courier New" w:hint="default"/>
+      </w:rPr>
+    </w:lvl>
+    <w:lvl w:ilvl="2" w:tplc="04090005" w:tentative="1">
+      <w:start w:val="1"/>
+      <w:numFmt w:val="bullet"/>
+      <w:lvlText w:val=""/>
+      <w:lvlJc w:val="left"/>
+      <w:pPr>
+        <w:ind w:left="2160" w:hanging="360"/>
+      </w:pPr>
+      <w:rPr>
+        <w:rFonts w:ascii="Wingdings" w:hAnsi="Wingdings" w:hint="default"/>
+      </w:rPr>
+    </w:lvl>
+    <w:lvl w:ilvl="3" w:tplc="04090001" w:tentative="1">
+      <w:start w:val="1"/>
+      <w:numFmt w:val="bullet"/>
+      <w:lvlText w:val=""/>
+      <w:lvlJc w:val="left"/>
+      <w:pPr>
+        <w:ind w:left="2880" w:hanging="360"/>
+      </w:pPr>
+      <w:rPr>
+        <w:rFonts w:ascii="Symbol" w:hAnsi="Symbol" w:hint="default"/>
+      </w:rPr>
+    </w:lvl>
+    <w:lvl w:ilvl="4" w:tplc="04090003" w:tentative="1">
+      <w:start w:val="1"/>
+      <w:numFmt w:val="bullet"/>
+      <w:lvlText w:val="o"/>
+      <w:lvlJc w:val="left"/>
+      <w:pPr>
+        <w:ind w:left="3600" w:hanging="360"/>
+      </w:pPr>
+      <w:rPr>
+        <w:rFonts w:ascii="Courier New" w:hAnsi="Courier New" w:cs="Courier New" w:hint="default"/>
+      </w:rPr>
+    </w:lvl>
+    <w:lvl w:ilvl="5" w:tplc="04090005" w:tentative="1">
+      <w:start w:val="1"/>
+      <w:numFmt w:val="bullet"/>
+      <w:lvlText w:val=""/>
+      <w:lvlJc w:val="left"/>
+      <w:pPr>
+        <w:ind w:left="4320" w:hanging="360"/>
+      </w:pPr>
+      <w:rPr>
+        <w:rFonts w:ascii="Wingdings" w:hAnsi="Wingdings" w:hint="default"/>
+      </w:rPr>
+    </w:lvl>
+    <w:lvl w:ilvl="6" w:tplc="04090001" w:tentative="1">
+      <w:start w:val="1"/>
+      <w:numFmt w:val="bullet"/>
+      <w:lvlText w:val=""/>
+      <w:lvlJc w:val="left"/>
+      <w:pPr>
+        <w:ind w:left="5040" w:hanging="360"/>
+      </w:pPr>
+      <w:rPr>
+        <w:rFonts w:ascii="Symbol" w:hAnsi="Symbol" w:hint="default"/>
+      </w:rPr>
+    </w:lvl>
+    <w:lvl w:ilvl="7" w:tplc="04090003" w:tentative="1">
+      <w:start w:val="1"/>
+      <w:numFmt w:val="bullet"/>
+      <w:lvlText w:val="o"/>
+      <w:lvlJc w:val="left"/>
+      <w:pPr>
+        <w:ind w:left="5760" w:hanging="360"/>
+      </w:pPr>
+      <w:rPr>
+        <w:rFonts w:ascii="Courier New" w:hAnsi="Courier New" w:cs="Courier New" w:hint="default"/>
+      </w:rPr>
+    </w:lvl>
+    <w:lvl w:ilvl="8" w:tplc="04090005" w:tentative="1">
+      <w:start w:val="1"/>
+      <w:numFmt w:val="bullet"/>
+      <w:lvlText w:val=""/>
+      <w:lvlJc w:val="left"/>
+      <w:pPr>
+        <w:ind w:left="6480" w:hanging="360"/>
+      </w:pPr>
+      <w:rPr>
+        <w:rFonts w:ascii="Wingdings" w:hAnsi="Wingdings" w:hint="default"/>
+      </w:rPr>
     </w:lvl>
   </w:abstractNum>
   <w:num w:numId="1">
@@ -778,6 +1411,9 @@
   </w:num>
   <w:num w:numId="2">
     <w:abstractNumId w:val="1"/>
+  </w:num>
+  <w:num w:numId="3">
+    <w:abstractNumId w:val="2"/>
   </w:num>
 </w:numbering>
 </file>
@@ -1184,7 +1820,6 @@
   <w:style w:type="character" w:default="1" w:styleId="DefaultParagraphFont">
     <w:name w:val="Default Paragraph Font"/>
     <w:uiPriority w:val="1"/>
-    <w:semiHidden/>
     <w:unhideWhenUsed/>
   </w:style>
   <w:style w:type="table" w:default="1" w:styleId="TableNormal">

</xml_diff>

<commit_message>
refactor: move source files into orion package
- Move core modules into src/orion subpackage
- Update test imports to reference orion package
</commit_message>
<xml_diff>
--- a/Notes About Project.docx
+++ b/Notes About Project.docx
@@ -26,10 +26,6 @@
     <w:p>
       <w:pPr>
         <w:pStyle w:val="ListParagraph"/>
-        <w:numPr>
-          <w:ilvl w:val="0"/>
-          <w:numId w:val="3"/>
-        </w:numPr>
         <w:rPr>
           <w:b/>
           <w:bCs/>
@@ -39,21 +35,6 @@
         </w:rPr>
       </w:pPr>
       <w:r>
-        <w:t xml:space="preserve">Solve AFC error being shown in terminal </w:t>
-      </w:r>
-      <w:r>
-        <w:t>for the gemini thingy or something</w:t>
-      </w:r>
-      <w:bookmarkStart w:id="0" w:name="_GoBack"/>
-      <w:bookmarkEnd w:id="0"/>
-    </w:p>
-    <w:p>
-      <w:pPr>
-        <w:pStyle w:val="ListParagraph"/>
-        <w:numPr>
-          <w:ilvl w:val="0"/>
-          <w:numId w:val="3"/>
-        </w:numPr>
         <w:rPr>
           <w:b/>
           <w:bCs/>
@@ -61,26 +42,7 @@
           <w:szCs w:val="32"/>
           <w:u w:val="single"/>
         </w:rPr>
-      </w:pPr>
-      <w:r>
-        <w:t xml:space="preserve">Should this pipeline be given a UI which shows everything or not since by giving the UI it could help to present to the normal non-technical stakeholders too how it works etc rather than just the technical stakeholders possibly and also UI in such a way that the backend still exists and visible easily </w:t>
-      </w:r>
-      <w:r>
-        <w:rPr>
-          <w:b/>
-          <w:bCs/>
-        </w:rPr>
-        <w:t xml:space="preserve">BUT NOT SURE NEED TO CONFIRM IF </w:t>
-      </w:r>
-      <w:r>
-        <w:rPr>
-          <w:b/>
-          <w:bCs/>
-        </w:rPr>
-        <w:t>SUITABLE FOR PIPELINE OR NOT</w:t>
-      </w:r>
-      <w:r>
-        <w:t xml:space="preserve"> as we’re already using docker so like can contain all this in a container like packaged in a way</w:t>
+        <w:t>NOTE: DO CONFIRM IF ALL UI RELATED ELEMENTS ARE SUITABLE FOR A PIPELINE PURPOSE OR NOT BEFORE IMPLEMENTATION</w:t>
       </w:r>
     </w:p>
     <w:p>
@@ -99,21 +61,29 @@
         </w:rPr>
       </w:pPr>
       <w:r>
-        <w:t>For the API reviewer endpoint possibly get like UI for that if possible this would again help in this case for both the non-technical audience and technical audience to understand it</w:t>
-      </w:r>
-    </w:p>
-    <w:p>
-      <w:pPr>
-        <w:pStyle w:val="ListParagraph"/>
-        <w:rPr>
-          <w:b/>
-          <w:bCs/>
-        </w:rPr>
-      </w:pPr>
-    </w:p>
-    <w:p>
-      <w:pPr>
-        <w:pStyle w:val="ListParagraph"/>
+        <w:t xml:space="preserve">For input there could be a UI or automatic file picker opening or someway or if can import some external module for this so it allows non-technical people to use it as well or something perhaps? </w:t>
+      </w:r>
+      <w:proofErr w:type="gramStart"/>
+      <w:r>
+        <w:t>Again</w:t>
+      </w:r>
+      <w:proofErr w:type="gramEnd"/>
+      <w:r>
+        <w:t xml:space="preserve"> make sure if following pipeline rules or </w:t>
+      </w:r>
+      <w:bookmarkStart w:id="0" w:name="_GoBack"/>
+      <w:bookmarkEnd w:id="0"/>
+      <w:r>
+        <w:t>not and sticking to project brief or not</w:t>
+      </w:r>
+    </w:p>
+    <w:p>
+      <w:pPr>
+        <w:pStyle w:val="ListParagraph"/>
+        <w:numPr>
+          <w:ilvl w:val="0"/>
+          <w:numId w:val="3"/>
+        </w:numPr>
         <w:rPr>
           <w:b/>
           <w:bCs/>
@@ -123,6 +93,408 @@
         </w:rPr>
       </w:pPr>
       <w:r>
+        <w:t xml:space="preserve">Propose a better folder and directory structure </w:t>
+      </w:r>
+      <w:proofErr w:type="spellStart"/>
+      <w:r>
+        <w:t>etc</w:t>
+      </w:r>
+      <w:proofErr w:type="spellEnd"/>
+      <w:r>
+        <w:t xml:space="preserve"> as well as packaging when importing modules or classes </w:t>
+      </w:r>
+      <w:proofErr w:type="spellStart"/>
+      <w:r>
+        <w:t>etc</w:t>
+      </w:r>
+      <w:proofErr w:type="spellEnd"/>
+      <w:r>
+        <w:t xml:space="preserve"> from other files </w:t>
+      </w:r>
+      <w:proofErr w:type="spellStart"/>
+      <w:r>
+        <w:t>kinda</w:t>
+      </w:r>
+      <w:proofErr w:type="spellEnd"/>
+      <w:r>
+        <w:t xml:space="preserve"> if there is any software dev way to do it or python way or something</w:t>
+      </w:r>
+    </w:p>
+    <w:p>
+      <w:pPr>
+        <w:pStyle w:val="ListParagraph"/>
+        <w:numPr>
+          <w:ilvl w:val="0"/>
+          <w:numId w:val="3"/>
+        </w:numPr>
+        <w:rPr>
+          <w:b/>
+          <w:bCs/>
+          <w:strike/>
+          <w:sz w:val="32"/>
+          <w:szCs w:val="32"/>
+          <w:u w:val="single"/>
+        </w:rPr>
+      </w:pPr>
+      <w:r>
+        <w:rPr>
+          <w:strike/>
+        </w:rPr>
+        <w:t xml:space="preserve">Possibly adding date time to reviewer payload allowing to further improve </w:t>
+      </w:r>
+      <w:proofErr w:type="spellStart"/>
+      <w:r>
+        <w:rPr>
+          <w:strike/>
+        </w:rPr>
+        <w:t>traceabaility</w:t>
+      </w:r>
+      <w:proofErr w:type="spellEnd"/>
+      <w:r>
+        <w:rPr>
+          <w:strike/>
+        </w:rPr>
+        <w:t xml:space="preserve"> if possible if there is a need or not? And then also sending that payload submission timestamp in the content header when the post request being made?</w:t>
+      </w:r>
+    </w:p>
+    <w:p>
+      <w:pPr>
+        <w:pStyle w:val="ListParagraph"/>
+        <w:numPr>
+          <w:ilvl w:val="0"/>
+          <w:numId w:val="3"/>
+        </w:numPr>
+        <w:rPr>
+          <w:b/>
+          <w:bCs/>
+          <w:strike/>
+          <w:sz w:val="32"/>
+          <w:szCs w:val="32"/>
+          <w:u w:val="single"/>
+        </w:rPr>
+      </w:pPr>
+      <w:r>
+        <w:rPr>
+          <w:strike/>
+        </w:rPr>
+        <w:t xml:space="preserve">Api_client.py: In </w:t>
+      </w:r>
+      <w:proofErr w:type="spellStart"/>
+      <w:r>
+        <w:rPr>
+          <w:strike/>
+        </w:rPr>
+        <w:t>emit_result</w:t>
+      </w:r>
+      <w:proofErr w:type="spellEnd"/>
+      <w:r>
+        <w:rPr>
+          <w:strike/>
+        </w:rPr>
+        <w:t xml:space="preserve"> possibly specifying a more specific header if </w:t>
+      </w:r>
+      <w:proofErr w:type="gramStart"/>
+      <w:r>
+        <w:rPr>
+          <w:strike/>
+        </w:rPr>
+        <w:t>possible</w:t>
+      </w:r>
+      <w:proofErr w:type="gramEnd"/>
+      <w:r>
+        <w:rPr>
+          <w:strike/>
+        </w:rPr>
+        <w:t xml:space="preserve"> to u know more specifically </w:t>
+      </w:r>
+      <w:proofErr w:type="spellStart"/>
+      <w:r>
+        <w:rPr>
+          <w:strike/>
+        </w:rPr>
+        <w:t>kinda</w:t>
+      </w:r>
+      <w:proofErr w:type="spellEnd"/>
+      <w:r>
+        <w:rPr>
+          <w:strike/>
+        </w:rPr>
+        <w:t xml:space="preserve"> indicate what kind of data is being sent over the website or basically being POSTED if that’s the case</w:t>
+      </w:r>
+    </w:p>
+    <w:p>
+      <w:pPr>
+        <w:pStyle w:val="ListParagraph"/>
+        <w:numPr>
+          <w:ilvl w:val="0"/>
+          <w:numId w:val="3"/>
+        </w:numPr>
+        <w:rPr>
+          <w:b/>
+          <w:bCs/>
+          <w:strike/>
+          <w:sz w:val="32"/>
+          <w:szCs w:val="32"/>
+          <w:u w:val="single"/>
+        </w:rPr>
+      </w:pPr>
+      <w:r>
+        <w:rPr>
+          <w:strike/>
+        </w:rPr>
+        <w:t>api_client.py: Possibly add more exceptions to detect specific error in case of errors being encountered or something and then printing in terminal or whatever or however the logging is being done to make life easy for the next developer or a mix of technical and non-technical person too</w:t>
+      </w:r>
+    </w:p>
+    <w:p>
+      <w:pPr>
+        <w:pStyle w:val="ListParagraph"/>
+        <w:numPr>
+          <w:ilvl w:val="0"/>
+          <w:numId w:val="3"/>
+        </w:numPr>
+        <w:rPr>
+          <w:strike/>
+          <w:sz w:val="32"/>
+          <w:szCs w:val="32"/>
+          <w:u w:val="single"/>
+        </w:rPr>
+      </w:pPr>
+      <w:r>
+        <w:rPr>
+          <w:strike/>
+        </w:rPr>
+        <w:t xml:space="preserve">Rather than utilizing composite scoring in scoring.py how about utilizing some complex finance related formula or finance industry related formula to first show that I have the domain knowledge for which this product is given for secondly also have </w:t>
+      </w:r>
+      <w:proofErr w:type="spellStart"/>
+      <w:r>
+        <w:rPr>
+          <w:strike/>
+        </w:rPr>
+        <w:t>kinda</w:t>
+      </w:r>
+      <w:proofErr w:type="spellEnd"/>
+      <w:r>
+        <w:rPr>
+          <w:strike/>
+        </w:rPr>
+        <w:t xml:space="preserve"> like a more deterministic and confirmed score like using some approach that’s always been used </w:t>
+      </w:r>
+      <w:proofErr w:type="spellStart"/>
+      <w:r>
+        <w:rPr>
+          <w:strike/>
+        </w:rPr>
+        <w:t>uptill</w:t>
+      </w:r>
+      <w:proofErr w:type="spellEnd"/>
+      <w:r>
+        <w:rPr>
+          <w:strike/>
+        </w:rPr>
+        <w:t xml:space="preserve"> now u know</w:t>
+      </w:r>
+    </w:p>
+    <w:p>
+      <w:pPr>
+        <w:pStyle w:val="ListParagraph"/>
+        <w:numPr>
+          <w:ilvl w:val="0"/>
+          <w:numId w:val="3"/>
+        </w:numPr>
+        <w:rPr>
+          <w:b/>
+          <w:bCs/>
+          <w:sz w:val="32"/>
+          <w:szCs w:val="32"/>
+          <w:u w:val="single"/>
+        </w:rPr>
+      </w:pPr>
+      <w:r>
+        <w:t xml:space="preserve">api_client.py: Rather than only posting to a simple </w:t>
+      </w:r>
+      <w:proofErr w:type="spellStart"/>
+      <w:r>
+        <w:t>httpbin</w:t>
+      </w:r>
+      <w:proofErr w:type="spellEnd"/>
+      <w:r>
+        <w:t xml:space="preserve"> URL how about some other site or </w:t>
+      </w:r>
+      <w:proofErr w:type="spellStart"/>
+      <w:r>
+        <w:t>httpbin</w:t>
+      </w:r>
+      <w:proofErr w:type="spellEnd"/>
+      <w:r>
+        <w:t xml:space="preserve"> only or something with a UI where it gets posted and actually allows the reviewer to review it and the make a decision or whatever the project scope mentions etc.</w:t>
+      </w:r>
+      <w:r>
+        <w:t xml:space="preserve"> (this is also because the specification mentions that the structured payload should be suitable for </w:t>
+      </w:r>
+      <w:r>
+        <w:rPr>
+          <w:b/>
+          <w:bCs/>
+        </w:rPr>
+        <w:t>reviewer validation and override</w:t>
+      </w:r>
+      <w:r>
+        <w:t xml:space="preserve"> hence I believe that there should be a approve or reject or edit and take over option inside the UI possibly?</w:t>
+      </w:r>
+    </w:p>
+    <w:p>
+      <w:pPr>
+        <w:pStyle w:val="ListParagraph"/>
+        <w:numPr>
+          <w:ilvl w:val="0"/>
+          <w:numId w:val="3"/>
+        </w:numPr>
+        <w:rPr>
+          <w:b/>
+          <w:bCs/>
+          <w:sz w:val="32"/>
+          <w:szCs w:val="32"/>
+          <w:u w:val="single"/>
+        </w:rPr>
+      </w:pPr>
+      <w:r>
+        <w:t xml:space="preserve">Possible to ask LLM for further extraction or possibly refining the extraction of key </w:t>
+      </w:r>
+      <w:proofErr w:type="spellStart"/>
+      <w:r>
+        <w:t>infos</w:t>
+      </w:r>
+      <w:proofErr w:type="spellEnd"/>
+      <w:r>
+        <w:t xml:space="preserve"> like Dimensions, Risk Level, Evidence already being extracted so how about anything else as well perhaps that could be more helpful and make pipeline much better and useful while sticking to the project specification. (do research on this for some other sample pipelines or systems similar to this perhaps).</w:t>
+      </w:r>
+    </w:p>
+    <w:p>
+      <w:pPr>
+        <w:pStyle w:val="ListParagraph"/>
+        <w:numPr>
+          <w:ilvl w:val="0"/>
+          <w:numId w:val="3"/>
+        </w:numPr>
+        <w:rPr>
+          <w:b/>
+          <w:bCs/>
+          <w:sz w:val="32"/>
+          <w:szCs w:val="32"/>
+          <w:u w:val="single"/>
+        </w:rPr>
+      </w:pPr>
+      <w:r>
+        <w:t xml:space="preserve">Solve AFC error being shown in terminal </w:t>
+      </w:r>
+      <w:r>
+        <w:t xml:space="preserve">for the </w:t>
+      </w:r>
+      <w:proofErr w:type="spellStart"/>
+      <w:r>
+        <w:t>gemini</w:t>
+      </w:r>
+      <w:proofErr w:type="spellEnd"/>
+      <w:r>
+        <w:t xml:space="preserve"> thingy or something</w:t>
+      </w:r>
+    </w:p>
+    <w:p>
+      <w:pPr>
+        <w:pStyle w:val="ListParagraph"/>
+        <w:numPr>
+          <w:ilvl w:val="0"/>
+          <w:numId w:val="3"/>
+        </w:numPr>
+        <w:rPr>
+          <w:b/>
+          <w:bCs/>
+          <w:sz w:val="32"/>
+          <w:szCs w:val="32"/>
+          <w:u w:val="single"/>
+        </w:rPr>
+      </w:pPr>
+      <w:r>
+        <w:t xml:space="preserve">Should this pipeline be given a UI which shows everything or not since by giving the UI it could help to present to the normal non-technical stakeholders too how it works </w:t>
+      </w:r>
+      <w:proofErr w:type="spellStart"/>
+      <w:r>
+        <w:t>etc</w:t>
+      </w:r>
+      <w:proofErr w:type="spellEnd"/>
+      <w:r>
+        <w:t xml:space="preserve"> rather than just the technical stakeholders possibly and also UI in such a way that the backend still exists and </w:t>
+      </w:r>
+      <w:r>
+        <w:lastRenderedPageBreak/>
+        <w:t xml:space="preserve">visible easily </w:t>
+      </w:r>
+      <w:r>
+        <w:rPr>
+          <w:b/>
+          <w:bCs/>
+        </w:rPr>
+        <w:t xml:space="preserve">BUT NOT SURE NEED TO CONFIRM IF </w:t>
+      </w:r>
+      <w:r>
+        <w:rPr>
+          <w:b/>
+          <w:bCs/>
+        </w:rPr>
+        <w:t>SUITABLE FOR PIPELINE OR NOT</w:t>
+      </w:r>
+      <w:r>
+        <w:t xml:space="preserve"> as we’re already using docker so like can contain all this in a container like packaged in a way</w:t>
+      </w:r>
+    </w:p>
+    <w:p>
+      <w:pPr>
+        <w:pStyle w:val="ListParagraph"/>
+        <w:numPr>
+          <w:ilvl w:val="0"/>
+          <w:numId w:val="3"/>
+        </w:numPr>
+        <w:rPr>
+          <w:b/>
+          <w:bCs/>
+          <w:sz w:val="32"/>
+          <w:szCs w:val="32"/>
+          <w:u w:val="single"/>
+        </w:rPr>
+      </w:pPr>
+      <w:r>
+        <w:t xml:space="preserve">For the API reviewer endpoint possibly get like UI for that if </w:t>
+      </w:r>
+      <w:proofErr w:type="gramStart"/>
+      <w:r>
+        <w:t>possible</w:t>
+      </w:r>
+      <w:proofErr w:type="gramEnd"/>
+      <w:r>
+        <w:t xml:space="preserve"> this would again help in this case for both the non-technical audience and technical audience to understand it</w:t>
+      </w:r>
+    </w:p>
+    <w:p>
+      <w:pPr>
+        <w:pStyle w:val="ListParagraph"/>
+        <w:rPr>
+          <w:b/>
+          <w:bCs/>
+        </w:rPr>
+      </w:pPr>
+    </w:p>
+    <w:p>
+      <w:pPr>
+        <w:pStyle w:val="ListParagraph"/>
+        <w:rPr>
+          <w:b/>
+          <w:bCs/>
+          <w:sz w:val="32"/>
+          <w:szCs w:val="32"/>
+          <w:u w:val="single"/>
+        </w:rPr>
+      </w:pPr>
+      <w:r>
         <w:rPr>
           <w:b/>
           <w:bCs/>
@@ -156,7 +528,15 @@
         </w:numPr>
       </w:pPr>
       <w:r>
-        <w:t>Search up projects or pipelines similar to this online and possible real-world applications or real companies operating on a structure like this or something maybe to check if urs is almost or nearly equivalent to theirs</w:t>
+        <w:t xml:space="preserve">Search up projects or pipelines similar to this online and possible real-world applications or real companies operating on a structure like this or something maybe to check if </w:t>
+      </w:r>
+      <w:proofErr w:type="spellStart"/>
+      <w:r>
+        <w:t>urs</w:t>
+      </w:r>
+      <w:proofErr w:type="spellEnd"/>
+      <w:r>
+        <w:t xml:space="preserve"> is almost or nearly equivalent to theirs</w:t>
       </w:r>
     </w:p>
     <w:p>
@@ -168,7 +548,23 @@
         </w:numPr>
       </w:pPr>
       <w:r>
-        <w:t>Rather than fetching only one file related to coinbase how about finding a AWS bucket or GCS (google) bucket which has a bunch of docs like this cuz I believe in case of audits there could be like a single company applicant having various applications in various sectors let’s say financial, digital infrastructure, governmental contracts and so on (if this is actually the case or not feel free to disagree on this if I’m wrong)</w:t>
+        <w:t xml:space="preserve">Rather than fetching only one file related to </w:t>
+      </w:r>
+      <w:proofErr w:type="spellStart"/>
+      <w:r>
+        <w:t>coinbase</w:t>
+      </w:r>
+      <w:proofErr w:type="spellEnd"/>
+      <w:r>
+        <w:t xml:space="preserve"> how about finding a AWS bucket or GCS (google) bucket which has a bunch of docs like this </w:t>
+      </w:r>
+      <w:proofErr w:type="spellStart"/>
+      <w:r>
+        <w:t>cuz</w:t>
+      </w:r>
+      <w:proofErr w:type="spellEnd"/>
+      <w:r>
+        <w:t xml:space="preserve"> I believe in case of audits there could be like a single company applicant having various applications in various sectors let’s say financial, digital infrastructure, governmental contracts and so on (if this is actually the case or not feel free to disagree on this if I’m wrong)</w:t>
       </w:r>
     </w:p>
     <w:p>
@@ -203,7 +599,17 @@
         <w:pStyle w:val="ListParagraph"/>
       </w:pPr>
       <w:r>
-        <w:t>            logger.warning("Regex failed to find Item 1A and 1B markers. Falling back to naive chunking.")</w:t>
+        <w:t xml:space="preserve">            </w:t>
+      </w:r>
+      <w:proofErr w:type="spellStart"/>
+      <w:proofErr w:type="gramStart"/>
+      <w:r>
+        <w:t>logger.warning</w:t>
+      </w:r>
+      <w:proofErr w:type="spellEnd"/>
+      <w:proofErr w:type="gramEnd"/>
+      <w:r>
+        <w:t>("Regex failed to find Item 1A and 1B markers. Falling back to naive chunking.")</w:t>
       </w:r>
     </w:p>
     <w:p>
@@ -219,20 +625,36 @@
         <w:pStyle w:val="ListParagraph"/>
       </w:pPr>
       <w:r>
-        <w:t>            return text[:20000]</w:t>
-      </w:r>
-    </w:p>
-    <w:p>
-      <w:pPr>
-        <w:pStyle w:val="ListParagraph"/>
-      </w:pPr>
-    </w:p>
-    <w:p>
-      <w:pPr>
-        <w:pStyle w:val="ListParagraph"/>
-      </w:pPr>
-      <w:r>
-        <w:t>^^^^ (how about not falling back to naïve chunking and simply outputting a error and flagging this for further review than wasting LLM tokens and resources unnecessarily and passing it further down pipeline causing more errors later on for the human reviewer)</w:t>
+        <w:t xml:space="preserve">            return </w:t>
+      </w:r>
+      <w:proofErr w:type="gramStart"/>
+      <w:r>
+        <w:t>text[</w:t>
+      </w:r>
+      <w:proofErr w:type="gramEnd"/>
+      <w:r>
+        <w:t>:20000]</w:t>
+      </w:r>
+    </w:p>
+    <w:p>
+      <w:pPr>
+        <w:pStyle w:val="ListParagraph"/>
+      </w:pPr>
+    </w:p>
+    <w:p>
+      <w:pPr>
+        <w:pStyle w:val="ListParagraph"/>
+      </w:pPr>
+      <w:r>
+        <w:t xml:space="preserve">^^^^ (how about not falling back to naïve chunking and simply outputting </w:t>
+      </w:r>
+      <w:proofErr w:type="gramStart"/>
+      <w:r>
+        <w:t>a</w:t>
+      </w:r>
+      <w:proofErr w:type="gramEnd"/>
+      <w:r>
+        <w:t xml:space="preserve"> error and flagging this for further review than wasting LLM tokens and resources unnecessarily and passing it further down pipeline causing more errors later on for the human reviewer)</w:t>
       </w:r>
     </w:p>
     <w:p>
@@ -265,60 +687,85 @@
         </w:rPr>
         <w:t xml:space="preserve"> </w:t>
       </w:r>
-      <w:r>
-        <w:rPr>
-          <w:i/>
-          <w:iCs/>
-        </w:rPr>
-        <w:t xml:space="preserve">max_chars = 60000 </w:t>
-      </w:r>
-    </w:p>
-    <w:p>
-      <w:pPr>
-        <w:pStyle w:val="ListParagraph"/>
-        <w:rPr>
-          <w:i/>
-          <w:iCs/>
-        </w:rPr>
-      </w:pPr>
-      <w:r>
-        <w:rPr>
-          <w:i/>
-          <w:iCs/>
-        </w:rPr>
-        <w:t>       if len(extracted_text) &gt; max_chars:</w:t>
-      </w:r>
-    </w:p>
-    <w:p>
-      <w:pPr>
-        <w:pStyle w:val="ListParagraph"/>
-        <w:rPr>
-          <w:i/>
-          <w:iCs/>
-        </w:rPr>
-      </w:pPr>
-      <w:r>
-        <w:rPr>
-          <w:i/>
-          <w:iCs/>
-        </w:rPr>
-        <w:t>            logger.info(f"Truncating extraction from {len(extracted_text)} to {max_chars} characters for token efficiency.")</w:t>
-      </w:r>
-    </w:p>
-    <w:p>
-      <w:pPr>
-        <w:pStyle w:val="ListParagraph"/>
-        <w:rPr>
-          <w:i/>
-          <w:iCs/>
-        </w:rPr>
-      </w:pPr>
-      <w:r>
-        <w:rPr>
-          <w:i/>
-          <w:iCs/>
-        </w:rPr>
-        <w:t>            extracted_text = extracted_text[:max_chars]</w:t>
+      <w:proofErr w:type="spellStart"/>
+      <w:r>
+        <w:rPr>
+          <w:i/>
+          <w:iCs/>
+        </w:rPr>
+        <w:t>max_chars</w:t>
+      </w:r>
+      <w:proofErr w:type="spellEnd"/>
+      <w:r>
+        <w:rPr>
+          <w:i/>
+          <w:iCs/>
+        </w:rPr>
+        <w:t xml:space="preserve"> = 60000 </w:t>
+      </w:r>
+    </w:p>
+    <w:p>
+      <w:pPr>
+        <w:pStyle w:val="ListParagraph"/>
+        <w:rPr>
+          <w:i/>
+          <w:iCs/>
+        </w:rPr>
+      </w:pPr>
+      <w:r>
+        <w:rPr>
+          <w:i/>
+          <w:iCs/>
+        </w:rPr>
+        <w:t xml:space="preserve">       if </w:t>
+      </w:r>
+      <w:proofErr w:type="spellStart"/>
+      <w:r>
+        <w:rPr>
+          <w:i/>
+          <w:iCs/>
+        </w:rPr>
+        <w:t>len</w:t>
+      </w:r>
+      <w:proofErr w:type="spellEnd"/>
+      <w:r>
+        <w:rPr>
+          <w:i/>
+          <w:iCs/>
+        </w:rPr>
+        <w:t>(</w:t>
+      </w:r>
+      <w:proofErr w:type="spellStart"/>
+      <w:r>
+        <w:rPr>
+          <w:i/>
+          <w:iCs/>
+        </w:rPr>
+        <w:t>extracted_text</w:t>
+      </w:r>
+      <w:proofErr w:type="spellEnd"/>
+      <w:r>
+        <w:rPr>
+          <w:i/>
+          <w:iCs/>
+        </w:rPr>
+        <w:t xml:space="preserve">) &gt; </w:t>
+      </w:r>
+      <w:proofErr w:type="spellStart"/>
+      <w:r>
+        <w:rPr>
+          <w:i/>
+          <w:iCs/>
+        </w:rPr>
+        <w:t>max_chars</w:t>
+      </w:r>
+      <w:proofErr w:type="spellEnd"/>
+      <w:r>
+        <w:rPr>
+          <w:i/>
+          <w:iCs/>
+        </w:rPr>
+        <w:t>:</w:t>
       </w:r>
     </w:p>
     <w:p>
@@ -336,53 +783,220 @@
         </w:rPr>
         <w:t xml:space="preserve">            </w:t>
       </w:r>
-    </w:p>
-    <w:p>
-      <w:pPr>
-        <w:pStyle w:val="ListParagraph"/>
-        <w:rPr>
-          <w:i/>
-          <w:iCs/>
-        </w:rPr>
-      </w:pPr>
-      <w:r>
-        <w:rPr>
-          <w:i/>
-          <w:iCs/>
-        </w:rPr>
-        <w:t>        return extracted_text</w:t>
-      </w:r>
-    </w:p>
-    <w:p>
-      <w:pPr>
-        <w:pStyle w:val="ListParagraph"/>
-      </w:pPr>
-      <w:r>
-        <w:t xml:space="preserve">^^^ (If we’re just truncating randomly this could risk leaving out important details no? so how about using semantic ranking technique like TF-IDF or BN25 or something like that not suer if they are applicable in our case but something like that allowing us to rank whole sentences or just select most heavy or u know context heavy words from the sentences and then ranking the </w:t>
-      </w:r>
+      <w:proofErr w:type="gramStart"/>
+      <w:r>
+        <w:rPr>
+          <w:i/>
+          <w:iCs/>
+        </w:rPr>
+        <w:t>logger.info(</w:t>
+      </w:r>
+      <w:proofErr w:type="spellStart"/>
+      <w:proofErr w:type="gramEnd"/>
+      <w:r>
+        <w:rPr>
+          <w:i/>
+          <w:iCs/>
+        </w:rPr>
+        <w:t>f"Truncating</w:t>
+      </w:r>
+      <w:proofErr w:type="spellEnd"/>
+      <w:r>
+        <w:rPr>
+          <w:i/>
+          <w:iCs/>
+        </w:rPr>
+        <w:t xml:space="preserve"> extraction from {</w:t>
+      </w:r>
+      <w:proofErr w:type="spellStart"/>
+      <w:r>
+        <w:rPr>
+          <w:i/>
+          <w:iCs/>
+        </w:rPr>
+        <w:t>len</w:t>
+      </w:r>
+      <w:proofErr w:type="spellEnd"/>
+      <w:r>
+        <w:rPr>
+          <w:i/>
+          <w:iCs/>
+        </w:rPr>
+        <w:t>(</w:t>
+      </w:r>
+      <w:proofErr w:type="spellStart"/>
+      <w:r>
+        <w:rPr>
+          <w:i/>
+          <w:iCs/>
+        </w:rPr>
+        <w:t>extracted_text</w:t>
+      </w:r>
+      <w:proofErr w:type="spellEnd"/>
+      <w:r>
+        <w:rPr>
+          <w:i/>
+          <w:iCs/>
+        </w:rPr>
+        <w:t>)} to {</w:t>
+      </w:r>
+      <w:proofErr w:type="spellStart"/>
+      <w:r>
+        <w:rPr>
+          <w:i/>
+          <w:iCs/>
+        </w:rPr>
+        <w:t>max_chars</w:t>
+      </w:r>
+      <w:proofErr w:type="spellEnd"/>
+      <w:r>
+        <w:rPr>
+          <w:i/>
+          <w:iCs/>
+        </w:rPr>
+        <w:t>} characters for token efficiency.")</w:t>
+      </w:r>
+    </w:p>
+    <w:p>
+      <w:pPr>
+        <w:pStyle w:val="ListParagraph"/>
+        <w:rPr>
+          <w:i/>
+          <w:iCs/>
+        </w:rPr>
+      </w:pPr>
+      <w:r>
+        <w:rPr>
+          <w:i/>
+          <w:iCs/>
+        </w:rPr>
+        <w:t xml:space="preserve">            </w:t>
+      </w:r>
+      <w:proofErr w:type="spellStart"/>
+      <w:r>
+        <w:rPr>
+          <w:i/>
+          <w:iCs/>
+        </w:rPr>
+        <w:t>extracted_text</w:t>
+      </w:r>
+      <w:proofErr w:type="spellEnd"/>
+      <w:r>
+        <w:rPr>
+          <w:i/>
+          <w:iCs/>
+        </w:rPr>
+        <w:t xml:space="preserve"> = </w:t>
+      </w:r>
+      <w:proofErr w:type="spellStart"/>
+      <w:r>
+        <w:rPr>
+          <w:i/>
+          <w:iCs/>
+        </w:rPr>
+        <w:t>extracted_text</w:t>
+      </w:r>
+      <w:proofErr w:type="spellEnd"/>
+      <w:r>
+        <w:rPr>
+          <w:i/>
+          <w:iCs/>
+        </w:rPr>
+        <w:t>[:</w:t>
+      </w:r>
+      <w:proofErr w:type="spellStart"/>
+      <w:r>
+        <w:rPr>
+          <w:i/>
+          <w:iCs/>
+        </w:rPr>
+        <w:t>max_chars</w:t>
+      </w:r>
+      <w:proofErr w:type="spellEnd"/>
+      <w:r>
+        <w:rPr>
+          <w:i/>
+          <w:iCs/>
+        </w:rPr>
+        <w:t>]</w:t>
+      </w:r>
+    </w:p>
+    <w:p>
+      <w:pPr>
+        <w:pStyle w:val="ListParagraph"/>
+        <w:rPr>
+          <w:i/>
+          <w:iCs/>
+        </w:rPr>
+      </w:pPr>
+      <w:r>
+        <w:rPr>
+          <w:i/>
+          <w:iCs/>
+        </w:rPr>
+        <w:t xml:space="preserve">            </w:t>
+      </w:r>
+    </w:p>
+    <w:p>
+      <w:pPr>
+        <w:pStyle w:val="ListParagraph"/>
+        <w:rPr>
+          <w:i/>
+          <w:iCs/>
+        </w:rPr>
+      </w:pPr>
+      <w:r>
+        <w:rPr>
+          <w:i/>
+          <w:iCs/>
+        </w:rPr>
+        <w:t xml:space="preserve">        return </w:t>
+      </w:r>
+      <w:proofErr w:type="spellStart"/>
+      <w:r>
+        <w:rPr>
+          <w:i/>
+          <w:iCs/>
+        </w:rPr>
+        <w:t>extracted_text</w:t>
+      </w:r>
+      <w:proofErr w:type="spellEnd"/>
+    </w:p>
+    <w:p>
+      <w:pPr>
+        <w:pStyle w:val="ListParagraph"/>
+      </w:pPr>
+      <w:r>
+        <w:t xml:space="preserve">^^^ (If we’re just truncating randomly this could risk leaving out important details no? so how about using semantic ranking technique like TF-IDF or BN25 or something like that not </w:t>
+      </w:r>
+      <w:proofErr w:type="spellStart"/>
+      <w:r>
+        <w:t>suer</w:t>
+      </w:r>
+      <w:proofErr w:type="spellEnd"/>
+      <w:r>
+        <w:t xml:space="preserve"> if they are applicable in our case but something like that allowing us to rank whole sentences or just select most heavy or u know context heavy words from the sentences and then ranking the whole sentences accordingly to get the most context in hence allowing earlier truncation as well making the pipeline more efficient this way as well as also leaving out the possibility of leaving out info through random truncation) (ALSO configure like check what context window our current model operates on and secondly if it’s a static context window or a dynamic window and then accordingly set the truncation size if we still need to truncate.)</w:t>
+      </w:r>
+    </w:p>
+    <w:p>
+      <w:pPr>
+        <w:pStyle w:val="ListParagraph"/>
+      </w:pPr>
+      <w:r>
+        <w:t xml:space="preserve"> </w:t>
+      </w:r>
+    </w:p>
+    <w:p>
+      <w:pPr>
+        <w:pStyle w:val="ListParagraph"/>
+      </w:pPr>
       <w:r>
         <w:lastRenderedPageBreak/>
-        <w:t>whole sentences accordingly to get the most context in hence allowing earlier truncation as well making the pipeline more efficient this way as well as also leaving out the possibility of leaving out info through random truncation) (ALSO configure like check what context window our current model operates on and secondly if it’s a static context window or a dynamic window and then accordingly set the truncation size if we still need to truncate.)</w:t>
-      </w:r>
-    </w:p>
-    <w:p>
-      <w:pPr>
-        <w:pStyle w:val="ListParagraph"/>
-      </w:pPr>
+        <w:t>^^^^ Another Idea for this: Another idea is that in case the text is extremely long then how about taking a efficient approach for this where the less complex things can be provided to a far cheaper LLM model that takes up less cost and the complex or the end high level decisions with the relevant context can be provide to a LLM which can  take up less cost but will only be reasoning rather than inferring as well which the cheaper LLM already does hence overall technically should spend less resources on LLM</w:t>
+      </w:r>
       <w:r>
         <w:t xml:space="preserve"> </w:t>
       </w:r>
-    </w:p>
-    <w:p>
-      <w:pPr>
-        <w:pStyle w:val="ListParagraph"/>
-      </w:pPr>
-      <w:r>
-        <w:t>^^^^ Another Idea for this: Another idea is that in case the text is extremely long then how about taking a efficient approach for this where the less complex things can be provided to a far cheaper LLM model that takes up less cost and the complex or the end high level decisions with the relevant context can be provide to a LLM which can  take up less cost but will only be reasoning rather than inferring as well which the cheaper LLM already does hence overall technically should spend less resources on LLM</w:t>
-      </w:r>
-      <w:r>
-        <w:t xml:space="preserve"> </w:t>
-      </w:r>
       <w:r>
         <w:rPr>
           <w:b/>
@@ -391,7 +1005,15 @@
         <w:t>HOWEVER</w:t>
       </w:r>
       <w:r>
-        <w:t xml:space="preserve"> we need to remain within the constraint of a fixed execution limit so need to keep that in mind when still deciding on how much time we’re taking specially to process the initial text and the semantically ranked text or something the way we’re gonna be proceeding basically)</w:t>
+        <w:t xml:space="preserve"> we need to remain within the constraint of a fixed execution limit so need to keep that in mind when still deciding on how much time we’re taking specially to process the initial text and the semantically ranked text or something the way we’re </w:t>
+      </w:r>
+      <w:proofErr w:type="spellStart"/>
+      <w:r>
+        <w:t>gonna</w:t>
+      </w:r>
+      <w:proofErr w:type="spellEnd"/>
+      <w:r>
+        <w:t xml:space="preserve"> be proceeding basically)</w:t>
       </w:r>
     </w:p>
     <w:p>
@@ -407,6 +1029,17 @@
           <w:numId w:val="3"/>
         </w:numPr>
       </w:pPr>
+      <w:r>
+        <w:t xml:space="preserve">FINALLY, make vs code agent re-review the whole codes again and update the README.MD accordingly with all the new codes </w:t>
+      </w:r>
+      <w:proofErr w:type="spellStart"/>
+      <w:r>
+        <w:t>etc</w:t>
+      </w:r>
+      <w:proofErr w:type="spellEnd"/>
+      <w:r>
+        <w:t xml:space="preserve"> in detail</w:t>
+      </w:r>
     </w:p>
     <w:p/>
     <w:p/>
@@ -491,7 +1124,23 @@
         </w:numPr>
       </w:pPr>
       <w:r>
-        <w:t>Agentic Workflows: Designing AI systems that can plan tasks, use external tools(searching web e..g) and self-correct errors.</w:t>
+        <w:t xml:space="preserve">Agentic Workflows: Designing AI systems that can plan tasks, use external </w:t>
+      </w:r>
+      <w:proofErr w:type="gramStart"/>
+      <w:r>
+        <w:t>tools(</w:t>
+      </w:r>
+      <w:proofErr w:type="gramEnd"/>
+      <w:r>
+        <w:t xml:space="preserve">searching web </w:t>
+      </w:r>
+      <w:proofErr w:type="spellStart"/>
+      <w:r>
+        <w:t>e..g</w:t>
+      </w:r>
+      <w:proofErr w:type="spellEnd"/>
+      <w:r>
+        <w:t>) and self-correct errors.</w:t>
       </w:r>
     </w:p>
     <w:p>
@@ -506,7 +1155,23 @@
         <w:t>Chaining &amp; State Management:</w:t>
       </w:r>
       <w:r>
-        <w:t xml:space="preserve"> Sequencing multiple model calls together using frameworks like LangChain or LlamaIndex while maintaining context of user convo.</w:t>
+        <w:t xml:space="preserve"> Sequencing multiple model calls together using frameworks like </w:t>
+      </w:r>
+      <w:proofErr w:type="spellStart"/>
+      <w:r>
+        <w:t>LangChain</w:t>
+      </w:r>
+      <w:proofErr w:type="spellEnd"/>
+      <w:r>
+        <w:t xml:space="preserve"> or </w:t>
+      </w:r>
+      <w:proofErr w:type="spellStart"/>
+      <w:r>
+        <w:t>LlamaIndex</w:t>
+      </w:r>
+      <w:proofErr w:type="spellEnd"/>
+      <w:r>
+        <w:t xml:space="preserve"> while maintaining context of user convo.</w:t>
       </w:r>
     </w:p>
     <w:p>
@@ -529,9 +1194,19 @@
           <w:numId w:val="1"/>
         </w:numPr>
       </w:pPr>
-      <w:r>
-        <w:t>MLOps and LLMOps</w:t>
-      </w:r>
+      <w:proofErr w:type="spellStart"/>
+      <w:r>
+        <w:t>MLOps</w:t>
+      </w:r>
+      <w:proofErr w:type="spellEnd"/>
+      <w:r>
+        <w:t xml:space="preserve"> and </w:t>
+      </w:r>
+      <w:proofErr w:type="spellStart"/>
+      <w:r>
+        <w:t>LLMOps</w:t>
+      </w:r>
+      <w:proofErr w:type="spellEnd"/>
     </w:p>
     <w:p>
       <w:pPr>
@@ -554,7 +1229,15 @@
         </w:numPr>
       </w:pPr>
       <w:r>
-        <w:t>Production Monitoring: Setting up real-time alterts- monitor system health, cost anomalies, data drift (real-world data changes from original training/testing data of model)</w:t>
+        <w:t xml:space="preserve">Production Monitoring: Setting up real-time </w:t>
+      </w:r>
+      <w:proofErr w:type="spellStart"/>
+      <w:r>
+        <w:t>alterts</w:t>
+      </w:r>
+      <w:proofErr w:type="spellEnd"/>
+      <w:r>
+        <w:t>- monitor system health, cost anomalies, data drift (real-world data changes from original training/testing data of model)</w:t>
       </w:r>
     </w:p>
     <w:p>
@@ -566,46 +1249,70 @@
         </w:numPr>
       </w:pPr>
       <w:r>
+        <w:t>Guardrails &amp; Security: Implementing runtime validation layers (</w:t>
+      </w:r>
+      <w:proofErr w:type="spellStart"/>
+      <w:r>
+        <w:t>NeMo</w:t>
+      </w:r>
+      <w:proofErr w:type="spellEnd"/>
+      <w:r>
+        <w:t xml:space="preserve"> Guardrails/Llama Guard) – filters out prompt injection attacks/malicious inputs before reaching model</w:t>
+      </w:r>
+    </w:p>
+    <w:p>
+      <w:pPr>
+        <w:pStyle w:val="ListParagraph"/>
+        <w:numPr>
+          <w:ilvl w:val="0"/>
+          <w:numId w:val="1"/>
+        </w:numPr>
+      </w:pPr>
+      <w:r>
+        <w:t>Evaluation</w:t>
+      </w:r>
+      <w:r>
+        <w:t>: measures how well AI system performs</w:t>
+      </w:r>
+    </w:p>
+    <w:p>
+      <w:pPr>
+        <w:pStyle w:val="ListParagraph"/>
+        <w:numPr>
+          <w:ilvl w:val="1"/>
+          <w:numId w:val="1"/>
+        </w:numPr>
+      </w:pPr>
+      <w:r>
+        <w:t xml:space="preserve">Performance </w:t>
+      </w:r>
+      <w:proofErr w:type="spellStart"/>
+      <w:r>
+        <w:t>Metricss</w:t>
+      </w:r>
+      <w:proofErr w:type="spellEnd"/>
+      <w:r>
+        <w:t xml:space="preserve">: Measures correctness using standard metrics like precision, recall, and F1-score for traditional ML or semantic similarity and task success rates for </w:t>
+      </w:r>
+      <w:proofErr w:type="spellStart"/>
+      <w:r>
+        <w:t>GenAI</w:t>
+      </w:r>
+      <w:proofErr w:type="spellEnd"/>
+      <w:r>
+        <w:t>.</w:t>
+      </w:r>
+    </w:p>
+    <w:p>
+      <w:pPr>
+        <w:pStyle w:val="ListParagraph"/>
+        <w:numPr>
+          <w:ilvl w:val="1"/>
+          <w:numId w:val="1"/>
+        </w:numPr>
+      </w:pPr>
+      <w:r>
         <w:lastRenderedPageBreak/>
-        <w:t>Guardrails &amp; Security: Implementing runtime validation layers (NeMo Guardrails/Llama Guard) – filters out prompt injection attacks/malicious inputs before reaching model</w:t>
-      </w:r>
-    </w:p>
-    <w:p>
-      <w:pPr>
-        <w:pStyle w:val="ListParagraph"/>
-        <w:numPr>
-          <w:ilvl w:val="0"/>
-          <w:numId w:val="1"/>
-        </w:numPr>
-      </w:pPr>
-      <w:r>
-        <w:t>Evaluation</w:t>
-      </w:r>
-      <w:r>
-        <w:t>: measures how well AI system performs</w:t>
-      </w:r>
-    </w:p>
-    <w:p>
-      <w:pPr>
-        <w:pStyle w:val="ListParagraph"/>
-        <w:numPr>
-          <w:ilvl w:val="1"/>
-          <w:numId w:val="1"/>
-        </w:numPr>
-      </w:pPr>
-      <w:r>
-        <w:t>Performance Metricss: Measures correctness using standard metrics like precision, recall, and F1-score for traditional ML or semantic similarity and task success rates for GenAI.</w:t>
-      </w:r>
-    </w:p>
-    <w:p>
-      <w:pPr>
-        <w:pStyle w:val="ListParagraph"/>
-        <w:numPr>
-          <w:ilvl w:val="1"/>
-          <w:numId w:val="1"/>
-        </w:numPr>
-      </w:pPr>
-      <w:r>
         <w:t>Operational Metrics: Tracks latency, computing power usage, financial cost per req.</w:t>
       </w:r>
     </w:p>
@@ -773,7 +1480,15 @@
         <w:spacing w:before="240"/>
       </w:pPr>
       <w:r>
-        <w:t>Key Issue: Unable to feed 100+ pages of raw text into a LLM without reaching serverless execution timeouts and dealing with massive latency and token cost.</w:t>
+        <w:t xml:space="preserve">Key Issue: Unable to feed 100+ pages of raw text into </w:t>
+      </w:r>
+      <w:proofErr w:type="gramStart"/>
+      <w:r>
+        <w:t>a</w:t>
+      </w:r>
+      <w:proofErr w:type="gramEnd"/>
+      <w:r>
+        <w:t xml:space="preserve"> LLM without reaching serverless execution timeouts and dealing with massive latency and token cost.</w:t>
       </w:r>
     </w:p>
     <w:p>
@@ -945,74 +1660,119 @@
           <w:b/>
           <w:bCs/>
         </w:rPr>
-        <w:t xml:space="preserve">Financial Solvency &amp; </w:t>
-      </w:r>
-      <w:r>
-        <w:rPr>
-          <w:b/>
-          <w:bCs/>
-        </w:rPr>
+        <w:t>Financial Solvency &amp; Counterparty Risk</w:t>
+      </w:r>
+      <w:r>
+        <w:t xml:space="preserve"> (capital adequacy, liquidity, balance sheet, health), </w:t>
+      </w:r>
+      <w:r>
+        <w:rPr>
+          <w:b/>
+          <w:bCs/>
+        </w:rPr>
+        <w:t>Data Governance &amp; Security</w:t>
+      </w:r>
+      <w:r>
+        <w:t xml:space="preserve"> (encryption, access controls, data residency)</w:t>
+      </w:r>
+    </w:p>
+    <w:p>
+      <w:pPr>
+        <w:pStyle w:val="ListParagraph"/>
+        <w:numPr>
+          <w:ilvl w:val="2"/>
+          <w:numId w:val="1"/>
+        </w:numPr>
+        <w:spacing w:before="240"/>
+      </w:pPr>
+      <w:r>
+        <w:t xml:space="preserve">Separate risk rating (high, low etc.) for each dimension with </w:t>
+      </w:r>
+      <w:r>
+        <w:rPr>
+          <w:b/>
+          <w:bCs/>
+        </w:rPr>
+        <w:t>evidence</w:t>
+      </w:r>
+    </w:p>
+    <w:p>
+      <w:pPr>
+        <w:pStyle w:val="ListParagraph"/>
+        <w:numPr>
+          <w:ilvl w:val="2"/>
+          <w:numId w:val="1"/>
+        </w:numPr>
+        <w:spacing w:before="240"/>
+      </w:pPr>
+      <w:r>
+        <w:t>Mathematical composite score i.e. a weighted average to keep final score explainable.</w:t>
+      </w:r>
+    </w:p>
+    <w:p>
+      <w:pPr>
+        <w:pStyle w:val="ListParagraph"/>
+        <w:numPr>
+          <w:ilvl w:val="0"/>
+          <w:numId w:val="1"/>
+        </w:numPr>
+        <w:spacing w:before="240"/>
+      </w:pPr>
+      <w:r>
+        <w:t>Decision:</w:t>
+      </w:r>
+    </w:p>
+    <w:p>
+      <w:pPr>
+        <w:pStyle w:val="ListParagraph"/>
+        <w:numPr>
+          <w:ilvl w:val="1"/>
+          <w:numId w:val="1"/>
+        </w:numPr>
+        <w:spacing w:before="240"/>
+      </w:pPr>
+      <w:r>
         <w:lastRenderedPageBreak/>
-        <w:t>Counterparty Risk</w:t>
-      </w:r>
-      <w:r>
-        <w:t xml:space="preserve"> (capital adequacy, liquidity, balance sheet, health), </w:t>
-      </w:r>
-      <w:r>
-        <w:rPr>
-          <w:b/>
-          <w:bCs/>
-        </w:rPr>
-        <w:t>Data Governance &amp; Security</w:t>
-      </w:r>
-      <w:r>
-        <w:t xml:space="preserve"> (encryption, access controls, data residency)</w:t>
-      </w:r>
-    </w:p>
-    <w:p>
-      <w:pPr>
-        <w:pStyle w:val="ListParagraph"/>
-        <w:numPr>
-          <w:ilvl w:val="2"/>
+        <w:t>Based on the composite scores &amp; threshold rules, grant decision like Full Authorization, Require Supervisory Audit etc.</w:t>
+      </w:r>
+    </w:p>
+    <w:p>
+      <w:pPr>
+        <w:pStyle w:val="ListParagraph"/>
+        <w:numPr>
+          <w:ilvl w:val="1"/>
           <w:numId w:val="1"/>
         </w:numPr>
         <w:spacing w:before="240"/>
       </w:pPr>
       <w:r>
-        <w:t xml:space="preserve">Separate risk rating (high, low etc.) for each dimension with </w:t>
-      </w:r>
-      <w:r>
-        <w:rPr>
-          <w:b/>
-          <w:bCs/>
-        </w:rPr>
-        <w:t>evidence</w:t>
-      </w:r>
-    </w:p>
-    <w:p>
-      <w:pPr>
-        <w:pStyle w:val="ListParagraph"/>
-        <w:numPr>
-          <w:ilvl w:val="2"/>
+        <w:t>In case of missing info or contradicting info from JSON with the documents, follow-up questions asked from applicant.</w:t>
+      </w:r>
+    </w:p>
+    <w:p>
+      <w:pPr>
+        <w:pStyle w:val="ListParagraph"/>
+        <w:numPr>
+          <w:ilvl w:val="0"/>
           <w:numId w:val="1"/>
         </w:numPr>
         <w:spacing w:before="240"/>
       </w:pPr>
       <w:r>
-        <w:t>Mathematical composite score i.e. a weighted average to keep final score explainable.</w:t>
-      </w:r>
-    </w:p>
-    <w:p>
-      <w:pPr>
-        <w:pStyle w:val="ListParagraph"/>
-        <w:numPr>
-          <w:ilvl w:val="0"/>
+        <w:t>Auditing:</w:t>
+      </w:r>
+    </w:p>
+    <w:p>
+      <w:pPr>
+        <w:pStyle w:val="ListParagraph"/>
+        <w:numPr>
+          <w:ilvl w:val="1"/>
           <w:numId w:val="1"/>
         </w:numPr>
         <w:spacing w:before="240"/>
       </w:pPr>
       <w:r>
-        <w:t>Decision:</w:t>
+        <w:t>Output Payload is against a strict set schema allowing human reviewer to ingest without being all over the place in diff schemas.</w:t>
       </w:r>
     </w:p>
     <w:p>
@@ -1025,59 +1785,15 @@
         <w:spacing w:before="240"/>
       </w:pPr>
       <w:r>
-        <w:t>Based on the composite scores &amp; threshold rules, grant decision like Full Authorization, Require Supervisory Audit etc.</w:t>
-      </w:r>
-    </w:p>
-    <w:p>
-      <w:pPr>
-        <w:pStyle w:val="ListParagraph"/>
-        <w:numPr>
-          <w:ilvl w:val="1"/>
-          <w:numId w:val="1"/>
-        </w:numPr>
-        <w:spacing w:before="240"/>
-      </w:pPr>
-      <w:r>
-        <w:t>In case of missing info or contradicting info from JSON with the documents, follow-up questions asked from applicant.</w:t>
-      </w:r>
-    </w:p>
-    <w:p>
-      <w:pPr>
-        <w:pStyle w:val="ListParagraph"/>
-        <w:numPr>
-          <w:ilvl w:val="0"/>
-          <w:numId w:val="1"/>
-        </w:numPr>
-        <w:spacing w:before="240"/>
-      </w:pPr>
-      <w:r>
-        <w:t>Auditing:</w:t>
-      </w:r>
-    </w:p>
-    <w:p>
-      <w:pPr>
-        <w:pStyle w:val="ListParagraph"/>
-        <w:numPr>
-          <w:ilvl w:val="1"/>
-          <w:numId w:val="1"/>
-        </w:numPr>
-        <w:spacing w:before="240"/>
-      </w:pPr>
-      <w:r>
-        <w:t>Output Payload is against a strict set schema allowing human reviewer to ingest without being all over the place in diff schemas.</w:t>
-      </w:r>
-    </w:p>
-    <w:p>
-      <w:pPr>
-        <w:pStyle w:val="ListParagraph"/>
-        <w:numPr>
-          <w:ilvl w:val="1"/>
-          <w:numId w:val="1"/>
-        </w:numPr>
-        <w:spacing w:before="240"/>
-      </w:pPr>
-      <w:r>
-        <w:t>Final JSON delivered to a external review API endpoint. Every score traceable back to log traces and raw text evidence (allows human analyst to verify in case of risk-flagging).</w:t>
+        <w:t xml:space="preserve">Final JSON delivered to </w:t>
+      </w:r>
+      <w:proofErr w:type="gramStart"/>
+      <w:r>
+        <w:t>a</w:t>
+      </w:r>
+      <w:proofErr w:type="gramEnd"/>
+      <w:r>
+        <w:t xml:space="preserve"> external review API endpoint. Every score traceable back to log traces and raw text evidence (allows human analyst to verify in case of risk-flagging).</w:t>
       </w:r>
     </w:p>
     <w:sectPr>

</xml_diff>

<commit_message>
feat(pipeline): support multi-doc and cloud URIs
- Add multi-document URI aggregation in pipeline
- Support mock cloud URIs resolving locally
- Update mock submission to use s3 URI scheme
- Clean up gitignore rules for pycache and pyc
</commit_message>
<xml_diff>
--- a/Notes About Project.docx
+++ b/Notes About Project.docx
@@ -69,12 +69,7 @@
       </w:r>
       <w:proofErr w:type="gramEnd"/>
       <w:r>
-        <w:t xml:space="preserve"> make sure if following pipeline rules or </w:t>
-      </w:r>
-      <w:bookmarkStart w:id="0" w:name="_GoBack"/>
-      <w:bookmarkEnd w:id="0"/>
-      <w:r>
-        <w:t>not and sticking to project brief or not</w:t>
+        <w:t xml:space="preserve"> make sure if following pipeline rules or not and sticking to project brief or not</w:t>
       </w:r>
     </w:p>
     <w:p>
@@ -87,38 +82,62 @@
         <w:rPr>
           <w:b/>
           <w:bCs/>
+          <w:strike/>
           <w:sz w:val="32"/>
           <w:szCs w:val="32"/>
           <w:u w:val="single"/>
         </w:rPr>
       </w:pPr>
       <w:r>
+        <w:rPr>
+          <w:strike/>
+        </w:rPr>
         <w:t xml:space="preserve">Propose a better folder and directory structure </w:t>
       </w:r>
       <w:proofErr w:type="spellStart"/>
       <w:r>
+        <w:rPr>
+          <w:strike/>
+        </w:rPr>
         <w:t>etc</w:t>
       </w:r>
       <w:proofErr w:type="spellEnd"/>
       <w:r>
+        <w:rPr>
+          <w:strike/>
+        </w:rPr>
         <w:t xml:space="preserve"> as well as packaging when importing modules or classes </w:t>
       </w:r>
       <w:proofErr w:type="spellStart"/>
       <w:r>
+        <w:rPr>
+          <w:strike/>
+        </w:rPr>
         <w:t>etc</w:t>
       </w:r>
       <w:proofErr w:type="spellEnd"/>
       <w:r>
+        <w:rPr>
+          <w:strike/>
+        </w:rPr>
         <w:t xml:space="preserve"> from other files </w:t>
       </w:r>
       <w:proofErr w:type="spellStart"/>
       <w:r>
+        <w:rPr>
+          <w:strike/>
+        </w:rPr>
         <w:t>kinda</w:t>
       </w:r>
       <w:proofErr w:type="spellEnd"/>
       <w:r>
+        <w:rPr>
+          <w:strike/>
+        </w:rPr>
         <w:t xml:space="preserve"> if there is any software dev way to do it or python way or something</w:t>
       </w:r>
+      <w:bookmarkStart w:id="0" w:name="_GoBack"/>
+      <w:bookmarkEnd w:id="0"/>
     </w:p>
     <w:p>
       <w:pPr>
@@ -304,42 +323,77 @@
         <w:rPr>
           <w:b/>
           <w:bCs/>
+          <w:strike/>
           <w:sz w:val="32"/>
           <w:szCs w:val="32"/>
           <w:u w:val="single"/>
         </w:rPr>
       </w:pPr>
       <w:r>
-        <w:t xml:space="preserve">api_client.py: Rather than only posting to a simple </w:t>
-      </w:r>
-      <w:proofErr w:type="spellStart"/>
-      <w:r>
-        <w:t>httpbin</w:t>
-      </w:r>
-      <w:proofErr w:type="spellEnd"/>
-      <w:r>
-        <w:t xml:space="preserve"> URL how about some other site or </w:t>
-      </w:r>
-      <w:proofErr w:type="spellStart"/>
-      <w:r>
-        <w:t>httpbin</w:t>
-      </w:r>
-      <w:proofErr w:type="spellEnd"/>
-      <w:r>
-        <w:t xml:space="preserve"> only or something with a UI where it gets posted and actually allows the reviewer to review it and the make a decision or whatever the project scope mentions etc.</w:t>
-      </w:r>
-      <w:r>
-        <w:t xml:space="preserve"> (this is also because the specification mentions that the structured payload should be suitable for </w:t>
-      </w:r>
-      <w:r>
-        <w:rPr>
-          <w:b/>
-          <w:bCs/>
-        </w:rPr>
-        <w:t>reviewer validation and override</w:t>
-      </w:r>
-      <w:r>
-        <w:t xml:space="preserve"> hence I believe that there should be a approve or reject or edit and take over option inside the UI possibly?</w:t>
+        <w:rPr>
+          <w:strike/>
+        </w:rPr>
+        <w:t xml:space="preserve">Solve AFC error being shown in terminal for the </w:t>
+      </w:r>
+      <w:proofErr w:type="spellStart"/>
+      <w:r>
+        <w:rPr>
+          <w:strike/>
+        </w:rPr>
+        <w:t>gemini</w:t>
+      </w:r>
+      <w:proofErr w:type="spellEnd"/>
+      <w:r>
+        <w:rPr>
+          <w:strike/>
+        </w:rPr>
+        <w:t xml:space="preserve"> thingy or something</w:t>
+      </w:r>
+    </w:p>
+    <w:p>
+      <w:pPr>
+        <w:pStyle w:val="ListParagraph"/>
+        <w:numPr>
+          <w:ilvl w:val="0"/>
+          <w:numId w:val="3"/>
+        </w:numPr>
+        <w:rPr>
+          <w:strike/>
+        </w:rPr>
+      </w:pPr>
+      <w:r>
+        <w:rPr>
+          <w:strike/>
+        </w:rPr>
+        <w:t xml:space="preserve">Rather than fetching only one file related to </w:t>
+      </w:r>
+      <w:proofErr w:type="spellStart"/>
+      <w:r>
+        <w:rPr>
+          <w:strike/>
+        </w:rPr>
+        <w:t>coinbase</w:t>
+      </w:r>
+      <w:proofErr w:type="spellEnd"/>
+      <w:r>
+        <w:rPr>
+          <w:strike/>
+        </w:rPr>
+        <w:t xml:space="preserve"> how about finding a AWS bucket or GCS (google) bucket which has a bunch of docs like this </w:t>
+      </w:r>
+      <w:proofErr w:type="spellStart"/>
+      <w:r>
+        <w:rPr>
+          <w:strike/>
+        </w:rPr>
+        <w:t>cuz</w:t>
+      </w:r>
+      <w:proofErr w:type="spellEnd"/>
+      <w:r>
+        <w:rPr>
+          <w:strike/>
+        </w:rPr>
+        <w:t xml:space="preserve"> I believe in case of audits there could be like a single company applicant having various applications in various sectors let’s say financial, digital infrastructure, governmental contracts and so on (if this is actually the case or not feel free to disagree on this if I’m wrong)</w:t>
       </w:r>
     </w:p>
     <w:p>
@@ -358,15 +412,36 @@
         </w:rPr>
       </w:pPr>
       <w:r>
-        <w:t xml:space="preserve">Possible to ask LLM for further extraction or possibly refining the extraction of key </w:t>
-      </w:r>
-      <w:proofErr w:type="spellStart"/>
-      <w:r>
-        <w:t>infos</w:t>
-      </w:r>
-      <w:proofErr w:type="spellEnd"/>
-      <w:r>
-        <w:t xml:space="preserve"> like Dimensions, Risk Level, Evidence already being extracted so how about anything else as well perhaps that could be more helpful and make pipeline much better and useful while sticking to the project specification. (do research on this for some other sample pipelines or systems similar to this perhaps).</w:t>
+        <w:t xml:space="preserve">api_client.py: Rather than only posting to a simple </w:t>
+      </w:r>
+      <w:proofErr w:type="spellStart"/>
+      <w:r>
+        <w:t>httpbin</w:t>
+      </w:r>
+      <w:proofErr w:type="spellEnd"/>
+      <w:r>
+        <w:t xml:space="preserve"> URL how about some other site or </w:t>
+      </w:r>
+      <w:proofErr w:type="spellStart"/>
+      <w:r>
+        <w:t>httpbin</w:t>
+      </w:r>
+      <w:proofErr w:type="spellEnd"/>
+      <w:r>
+        <w:t xml:space="preserve"> only or something with a UI where it gets posted and actually allows the reviewer to review it and the make a decision or whatever the project scope mentions etc.</w:t>
+      </w:r>
+      <w:r>
+        <w:t xml:space="preserve"> (this is also because the specification mentions that the structured payload should be suitable for </w:t>
+      </w:r>
+      <w:r>
+        <w:rPr>
+          <w:b/>
+          <w:bCs/>
+        </w:rPr>
+        <w:t>reviewer validation and override</w:t>
+      </w:r>
+      <w:r>
+        <w:t xml:space="preserve"> hence I believe that there should be a approve or reject or edit and take over option inside the UI possibly?</w:t>
       </w:r>
     </w:p>
     <w:p>
@@ -385,18 +460,19 @@
         </w:rPr>
       </w:pPr>
       <w:r>
-        <w:t xml:space="preserve">Solve AFC error being shown in terminal </w:t>
-      </w:r>
-      <w:r>
-        <w:t xml:space="preserve">for the </w:t>
-      </w:r>
-      <w:proofErr w:type="spellStart"/>
-      <w:r>
-        <w:t>gemini</w:t>
-      </w:r>
-      <w:proofErr w:type="spellEnd"/>
-      <w:r>
-        <w:t xml:space="preserve"> thingy or something</w:t>
+        <w:t xml:space="preserve">Possible to ask LLM for further extraction or possibly refining the extraction of key </w:t>
+      </w:r>
+      <w:proofErr w:type="spellStart"/>
+      <w:r>
+        <w:t>infos</w:t>
+      </w:r>
+      <w:proofErr w:type="spellEnd"/>
+      <w:r>
+        <w:t xml:space="preserve"> like Dimensions, Risk Level, Evidence already being extracted so how about anything else as well perhaps that could be more helpful and make pipeline much better and useful while sticking to </w:t>
+      </w:r>
+      <w:r>
+        <w:lastRenderedPageBreak/>
+        <w:t>the project specification. (do research on this for some other sample pipelines or systems similar to this perhaps).</w:t>
       </w:r>
     </w:p>
     <w:p>
@@ -423,11 +499,7 @@
       </w:r>
       <w:proofErr w:type="spellEnd"/>
       <w:r>
-        <w:t xml:space="preserve"> rather than just the technical stakeholders possibly and also UI in such a way that the backend still exists and </w:t>
-      </w:r>
-      <w:r>
-        <w:lastRenderedPageBreak/>
-        <w:t xml:space="preserve">visible easily </w:t>
+        <w:t xml:space="preserve"> rather than just the technical stakeholders possibly and also UI in such a way that the backend still exists and visible easily </w:t>
       </w:r>
       <w:r>
         <w:rPr>
@@ -517,54 +589,6 @@
       </w:pPr>
       <w:r>
         <w:t>Possibly having a bit flexible applicant metadata of some form or something since dealing with different organizations perhaps or something?</w:t>
-      </w:r>
-    </w:p>
-    <w:p>
-      <w:pPr>
-        <w:pStyle w:val="ListParagraph"/>
-        <w:numPr>
-          <w:ilvl w:val="0"/>
-          <w:numId w:val="3"/>
-        </w:numPr>
-      </w:pPr>
-      <w:r>
-        <w:t xml:space="preserve">Search up projects or pipelines similar to this online and possible real-world applications or real companies operating on a structure like this or something maybe to check if </w:t>
-      </w:r>
-      <w:proofErr w:type="spellStart"/>
-      <w:r>
-        <w:t>urs</w:t>
-      </w:r>
-      <w:proofErr w:type="spellEnd"/>
-      <w:r>
-        <w:t xml:space="preserve"> is almost or nearly equivalent to theirs</w:t>
-      </w:r>
-    </w:p>
-    <w:p>
-      <w:pPr>
-        <w:pStyle w:val="ListParagraph"/>
-        <w:numPr>
-          <w:ilvl w:val="0"/>
-          <w:numId w:val="3"/>
-        </w:numPr>
-      </w:pPr>
-      <w:r>
-        <w:t xml:space="preserve">Rather than fetching only one file related to </w:t>
-      </w:r>
-      <w:proofErr w:type="spellStart"/>
-      <w:r>
-        <w:t>coinbase</w:t>
-      </w:r>
-      <w:proofErr w:type="spellEnd"/>
-      <w:r>
-        <w:t xml:space="preserve"> how about finding a AWS bucket or GCS (google) bucket which has a bunch of docs like this </w:t>
-      </w:r>
-      <w:proofErr w:type="spellStart"/>
-      <w:r>
-        <w:t>cuz</w:t>
-      </w:r>
-      <w:proofErr w:type="spellEnd"/>
-      <w:r>
-        <w:t xml:space="preserve"> I believe in case of audits there could be like a single company applicant having various applications in various sectors let’s say financial, digital infrastructure, governmental contracts and so on (if this is actually the case or not feel free to disagree on this if I’m wrong)</w:t>
       </w:r>
     </w:p>
     <w:p>
@@ -991,8 +1015,11 @@
         <w:pStyle w:val="ListParagraph"/>
       </w:pPr>
       <w:r>
+        <w:t xml:space="preserve">^^^^ Another Idea for this: Another idea is that in case the text is extremely long then how about taking a efficient approach for this where the less complex things can be provided to a far cheaper LLM model that takes up less cost and the complex or the end high level decisions with the relevant context can be provide to a LLM which can  take up less cost but will only be </w:t>
+      </w:r>
+      <w:r>
         <w:lastRenderedPageBreak/>
-        <w:t>^^^^ Another Idea for this: Another idea is that in case the text is extremely long then how about taking a efficient approach for this where the less complex things can be provided to a far cheaper LLM model that takes up less cost and the complex or the end high level decisions with the relevant context can be provide to a LLM which can  take up less cost but will only be reasoning rather than inferring as well which the cheaper LLM already does hence overall technically should spend less resources on LLM</w:t>
+        <w:t>reasoning rather than inferring as well which the cheaper LLM already does hence overall technically should spend less resources on LLM</w:t>
       </w:r>
       <w:r>
         <w:t xml:space="preserve"> </w:t>
@@ -1312,31 +1339,31 @@
         </w:numPr>
       </w:pPr>
       <w:r>
+        <w:t>Operational Metrics: Tracks latency, computing power usage, financial cost per req.</w:t>
+      </w:r>
+    </w:p>
+    <w:p>
+      <w:pPr>
+        <w:pStyle w:val="ListParagraph"/>
+        <w:numPr>
+          <w:ilvl w:val="1"/>
+          <w:numId w:val="1"/>
+        </w:numPr>
+      </w:pPr>
+      <w:r>
+        <w:t>Safety &amp; Alignment: Testing for harmful, toxic outputs, and bias using red-teaming and automated safety guardrails.</w:t>
+      </w:r>
+    </w:p>
+    <w:p>
+      <w:pPr>
+        <w:pStyle w:val="ListParagraph"/>
+        <w:numPr>
+          <w:ilvl w:val="1"/>
+          <w:numId w:val="1"/>
+        </w:numPr>
+      </w:pPr>
+      <w:r>
         <w:lastRenderedPageBreak/>
-        <w:t>Operational Metrics: Tracks latency, computing power usage, financial cost per req.</w:t>
-      </w:r>
-    </w:p>
-    <w:p>
-      <w:pPr>
-        <w:pStyle w:val="ListParagraph"/>
-        <w:numPr>
-          <w:ilvl w:val="1"/>
-          <w:numId w:val="1"/>
-        </w:numPr>
-      </w:pPr>
-      <w:r>
-        <w:t>Safety &amp; Alignment: Testing for harmful, toxic outputs, and bias using red-teaming and automated safety guardrails.</w:t>
-      </w:r>
-    </w:p>
-    <w:p>
-      <w:pPr>
-        <w:pStyle w:val="ListParagraph"/>
-        <w:numPr>
-          <w:ilvl w:val="1"/>
-          <w:numId w:val="1"/>
-        </w:numPr>
-      </w:pPr>
-      <w:r>
         <w:t xml:space="preserve">Evaluation Methods: using offline test datasets for baseline scores, human-in-the-loop (HITL) reviews for </w:t>
       </w:r>
       <w:r>
@@ -1732,20 +1759,20 @@
         <w:spacing w:before="240"/>
       </w:pPr>
       <w:r>
+        <w:t>Based on the composite scores &amp; threshold rules, grant decision like Full Authorization, Require Supervisory Audit etc.</w:t>
+      </w:r>
+    </w:p>
+    <w:p>
+      <w:pPr>
+        <w:pStyle w:val="ListParagraph"/>
+        <w:numPr>
+          <w:ilvl w:val="1"/>
+          <w:numId w:val="1"/>
+        </w:numPr>
+        <w:spacing w:before="240"/>
+      </w:pPr>
+      <w:r>
         <w:lastRenderedPageBreak/>
-        <w:t>Based on the composite scores &amp; threshold rules, grant decision like Full Authorization, Require Supervisory Audit etc.</w:t>
-      </w:r>
-    </w:p>
-    <w:p>
-      <w:pPr>
-        <w:pStyle w:val="ListParagraph"/>
-        <w:numPr>
-          <w:ilvl w:val="1"/>
-          <w:numId w:val="1"/>
-        </w:numPr>
-        <w:spacing w:before="240"/>
-      </w:pPr>
-      <w:r>
         <w:t>In case of missing info or contradicting info from JSON with the documents, follow-up questions asked from applicant.</w:t>
       </w:r>
     </w:p>

</xml_diff>

<commit_message>
feat(api): add dynamic reviewer UI and context caps
- Add dynamic webhook endpoint for UI inspection
- Cap aggregate document context to 800k chars
- Raise error on external API delivery failure
- Update project documentation and scope details
</commit_message>
<xml_diff>
--- a/Notes About Project.docx
+++ b/Notes About Project.docx
@@ -55,21 +55,85 @@
         <w:rPr>
           <w:b/>
           <w:bCs/>
+          <w:strike/>
           <w:sz w:val="32"/>
           <w:szCs w:val="32"/>
           <w:u w:val="single"/>
         </w:rPr>
       </w:pPr>
       <w:r>
-        <w:t xml:space="preserve">For input there could be a UI or automatic file picker opening or someway or if can import some external module for this so it allows non-technical people to use it as well or something perhaps? </w:t>
-      </w:r>
+        <w:rPr>
+          <w:strike/>
+        </w:rPr>
+        <w:t>“</w:t>
+      </w:r>
+      <w:proofErr w:type="spellStart"/>
       <w:proofErr w:type="gramStart"/>
       <w:r>
-        <w:t>Again</w:t>
+        <w:rPr>
+          <w:strike/>
+        </w:rPr>
+        <w:t>google.genai</w:t>
       </w:r>
       <w:proofErr w:type="gramEnd"/>
       <w:r>
-        <w:t xml:space="preserve"> make sure if following pipeline rules or not and sticking to project brief or not</w:t>
+        <w:rPr>
+          <w:strike/>
+        </w:rPr>
+        <w:t>.errors.ServerError</w:t>
+      </w:r>
+      <w:proofErr w:type="spellEnd"/>
+      <w:r>
+        <w:rPr>
+          <w:strike/>
+        </w:rPr>
+        <w:t>: 503 UNAVAILABLE. {'error': {'code': 503, 'message': 'This model is currently experiencing high demand. Spikes in demand are usually temporary. Please try again later.', 'status': 'UNAVAILABLE'}}</w:t>
+      </w:r>
+      <w:r>
+        <w:rPr>
+          <w:strike/>
+        </w:rPr>
+        <w:t>” in case of a error like this could implement dynamic model switching and then last case scenario it fails in case we haven’t already implemented or some other approach perhaps</w:t>
+      </w:r>
+      <w:r>
+        <w:rPr>
+          <w:strike/>
+        </w:rPr>
+        <w:t xml:space="preserve"> and also with dynamic model switching might have to implement max </w:t>
+      </w:r>
+      <w:proofErr w:type="spellStart"/>
+      <w:r>
+        <w:rPr>
+          <w:strike/>
+        </w:rPr>
+        <w:t>charaters</w:t>
+      </w:r>
+      <w:proofErr w:type="spellEnd"/>
+      <w:r>
+        <w:rPr>
+          <w:strike/>
+        </w:rPr>
+        <w:t xml:space="preserve"> dynamic switching </w:t>
+      </w:r>
+      <w:proofErr w:type="spellStart"/>
+      <w:r>
+        <w:rPr>
+          <w:strike/>
+        </w:rPr>
+        <w:t>accordinging</w:t>
+      </w:r>
+      <w:proofErr w:type="spellEnd"/>
+      <w:r>
+        <w:rPr>
+          <w:strike/>
+        </w:rPr>
+        <w:t xml:space="preserve"> to each model selection as well due to context window limit or something</w:t>
+      </w:r>
+      <w:r>
+        <w:rPr>
+          <w:strike/>
+        </w:rPr>
+        <w:t>?</w:t>
       </w:r>
     </w:p>
     <w:p>
@@ -92,52 +156,22 @@
         <w:rPr>
           <w:strike/>
         </w:rPr>
-        <w:t xml:space="preserve">Propose a better folder and directory structure </w:t>
-      </w:r>
-      <w:proofErr w:type="spellStart"/>
-      <w:r>
-        <w:rPr>
-          <w:strike/>
-        </w:rPr>
-        <w:t>etc</w:t>
-      </w:r>
-      <w:proofErr w:type="spellEnd"/>
-      <w:r>
-        <w:rPr>
-          <w:strike/>
-        </w:rPr>
-        <w:t xml:space="preserve"> as well as packaging when importing modules or classes </w:t>
-      </w:r>
-      <w:proofErr w:type="spellStart"/>
-      <w:r>
-        <w:rPr>
-          <w:strike/>
-        </w:rPr>
-        <w:t>etc</w:t>
-      </w:r>
-      <w:proofErr w:type="spellEnd"/>
-      <w:r>
-        <w:rPr>
-          <w:strike/>
-        </w:rPr>
-        <w:t xml:space="preserve"> from other files </w:t>
-      </w:r>
-      <w:proofErr w:type="spellStart"/>
-      <w:r>
-        <w:rPr>
-          <w:strike/>
-        </w:rPr>
-        <w:t>kinda</w:t>
-      </w:r>
-      <w:proofErr w:type="spellEnd"/>
-      <w:r>
-        <w:rPr>
-          <w:strike/>
-        </w:rPr>
-        <w:t xml:space="preserve"> if there is any software dev way to do it or python way or something</w:t>
-      </w:r>
-      <w:bookmarkStart w:id="0" w:name="_GoBack"/>
-      <w:bookmarkEnd w:id="0"/>
+        <w:t xml:space="preserve">For input there could be a UI or automatic file picker opening or someway or if can import some external module for this so it allows non-technical people to use it as well or something perhaps? </w:t>
+      </w:r>
+      <w:proofErr w:type="gramStart"/>
+      <w:r>
+        <w:rPr>
+          <w:strike/>
+        </w:rPr>
+        <w:t>Again</w:t>
+      </w:r>
+      <w:proofErr w:type="gramEnd"/>
+      <w:r>
+        <w:rPr>
+          <w:strike/>
+        </w:rPr>
+        <w:t xml:space="preserve"> make sure if following pipeline rules or not and sticking to project brief or not</w:t>
+      </w:r>
     </w:p>
     <w:p>
       <w:pPr>
@@ -159,21 +193,49 @@
         <w:rPr>
           <w:strike/>
         </w:rPr>
-        <w:t xml:space="preserve">Possibly adding date time to reviewer payload allowing to further improve </w:t>
-      </w:r>
-      <w:proofErr w:type="spellStart"/>
-      <w:r>
-        <w:rPr>
-          <w:strike/>
-        </w:rPr>
-        <w:t>traceabaility</w:t>
-      </w:r>
-      <w:proofErr w:type="spellEnd"/>
-      <w:r>
-        <w:rPr>
-          <w:strike/>
-        </w:rPr>
-        <w:t xml:space="preserve"> if possible if there is a need or not? And then also sending that payload submission timestamp in the content header when the post request being made?</w:t>
+        <w:t xml:space="preserve">Propose a better folder and directory structure </w:t>
+      </w:r>
+      <w:proofErr w:type="spellStart"/>
+      <w:r>
+        <w:rPr>
+          <w:strike/>
+        </w:rPr>
+        <w:t>etc</w:t>
+      </w:r>
+      <w:proofErr w:type="spellEnd"/>
+      <w:r>
+        <w:rPr>
+          <w:strike/>
+        </w:rPr>
+        <w:t xml:space="preserve"> as well as packaging when importing modules or classes </w:t>
+      </w:r>
+      <w:proofErr w:type="spellStart"/>
+      <w:r>
+        <w:rPr>
+          <w:strike/>
+        </w:rPr>
+        <w:t>etc</w:t>
+      </w:r>
+      <w:proofErr w:type="spellEnd"/>
+      <w:r>
+        <w:rPr>
+          <w:strike/>
+        </w:rPr>
+        <w:t xml:space="preserve"> from other files </w:t>
+      </w:r>
+      <w:proofErr w:type="spellStart"/>
+      <w:r>
+        <w:rPr>
+          <w:strike/>
+        </w:rPr>
+        <w:t>kinda</w:t>
+      </w:r>
+      <w:proofErr w:type="spellEnd"/>
+      <w:r>
+        <w:rPr>
+          <w:strike/>
+        </w:rPr>
+        <w:t xml:space="preserve"> if there is any software dev way to do it or python way or something</w:t>
       </w:r>
     </w:p>
     <w:p>
@@ -196,49 +258,21 @@
         <w:rPr>
           <w:strike/>
         </w:rPr>
-        <w:t xml:space="preserve">Api_client.py: In </w:t>
-      </w:r>
-      <w:proofErr w:type="spellStart"/>
-      <w:r>
-        <w:rPr>
-          <w:strike/>
-        </w:rPr>
-        <w:t>emit_result</w:t>
-      </w:r>
-      <w:proofErr w:type="spellEnd"/>
-      <w:r>
-        <w:rPr>
-          <w:strike/>
-        </w:rPr>
-        <w:t xml:space="preserve"> possibly specifying a more specific header if </w:t>
-      </w:r>
-      <w:proofErr w:type="gramStart"/>
-      <w:r>
-        <w:rPr>
-          <w:strike/>
-        </w:rPr>
-        <w:t>possible</w:t>
-      </w:r>
-      <w:proofErr w:type="gramEnd"/>
-      <w:r>
-        <w:rPr>
-          <w:strike/>
-        </w:rPr>
-        <w:t xml:space="preserve"> to u know more specifically </w:t>
-      </w:r>
-      <w:proofErr w:type="spellStart"/>
-      <w:r>
-        <w:rPr>
-          <w:strike/>
-        </w:rPr>
-        <w:t>kinda</w:t>
-      </w:r>
-      <w:proofErr w:type="spellEnd"/>
-      <w:r>
-        <w:rPr>
-          <w:strike/>
-        </w:rPr>
-        <w:t xml:space="preserve"> indicate what kind of data is being sent over the website or basically being POSTED if that’s the case</w:t>
+        <w:t xml:space="preserve">Possibly adding date time to reviewer payload allowing to further improve </w:t>
+      </w:r>
+      <w:proofErr w:type="spellStart"/>
+      <w:r>
+        <w:rPr>
+          <w:strike/>
+        </w:rPr>
+        <w:t>traceabaility</w:t>
+      </w:r>
+      <w:proofErr w:type="spellEnd"/>
+      <w:r>
+        <w:rPr>
+          <w:strike/>
+        </w:rPr>
+        <w:t xml:space="preserve"> if possible if there is a need or not? And then also sending that payload submission timestamp in the content header when the post request being made?</w:t>
       </w:r>
     </w:p>
     <w:p>
@@ -261,7 +295,49 @@
         <w:rPr>
           <w:strike/>
         </w:rPr>
-        <w:t>api_client.py: Possibly add more exceptions to detect specific error in case of errors being encountered or something and then printing in terminal or whatever or however the logging is being done to make life easy for the next developer or a mix of technical and non-technical person too</w:t>
+        <w:t xml:space="preserve">Api_client.py: In </w:t>
+      </w:r>
+      <w:proofErr w:type="spellStart"/>
+      <w:r>
+        <w:rPr>
+          <w:strike/>
+        </w:rPr>
+        <w:t>emit_result</w:t>
+      </w:r>
+      <w:proofErr w:type="spellEnd"/>
+      <w:r>
+        <w:rPr>
+          <w:strike/>
+        </w:rPr>
+        <w:t xml:space="preserve"> possibly specifying a more specific header if </w:t>
+      </w:r>
+      <w:proofErr w:type="gramStart"/>
+      <w:r>
+        <w:rPr>
+          <w:strike/>
+        </w:rPr>
+        <w:t>possible</w:t>
+      </w:r>
+      <w:proofErr w:type="gramEnd"/>
+      <w:r>
+        <w:rPr>
+          <w:strike/>
+        </w:rPr>
+        <w:t xml:space="preserve"> to u know more specifically </w:t>
+      </w:r>
+      <w:proofErr w:type="spellStart"/>
+      <w:r>
+        <w:rPr>
+          <w:strike/>
+        </w:rPr>
+        <w:t>kinda</w:t>
+      </w:r>
+      <w:proofErr w:type="spellEnd"/>
+      <w:r>
+        <w:rPr>
+          <w:strike/>
+        </w:rPr>
+        <w:t xml:space="preserve"> indicate what kind of data is being sent over the website or basically being POSTED if that’s the case</w:t>
       </w:r>
     </w:p>
     <w:p>
@@ -272,6 +348,8 @@
           <w:numId w:val="3"/>
         </w:numPr>
         <w:rPr>
+          <w:b/>
+          <w:bCs/>
           <w:strike/>
           <w:sz w:val="32"/>
           <w:szCs w:val="32"/>
@@ -282,35 +360,7 @@
         <w:rPr>
           <w:strike/>
         </w:rPr>
-        <w:t xml:space="preserve">Rather than utilizing composite scoring in scoring.py how about utilizing some complex finance related formula or finance industry related formula to first show that I have the domain knowledge for which this product is given for secondly also have </w:t>
-      </w:r>
-      <w:proofErr w:type="spellStart"/>
-      <w:r>
-        <w:rPr>
-          <w:strike/>
-        </w:rPr>
-        <w:t>kinda</w:t>
-      </w:r>
-      <w:proofErr w:type="spellEnd"/>
-      <w:r>
-        <w:rPr>
-          <w:strike/>
-        </w:rPr>
-        <w:t xml:space="preserve"> like a more deterministic and confirmed score like using some approach that’s always been used </w:t>
-      </w:r>
-      <w:proofErr w:type="spellStart"/>
-      <w:r>
-        <w:rPr>
-          <w:strike/>
-        </w:rPr>
-        <w:t>uptill</w:t>
-      </w:r>
-      <w:proofErr w:type="spellEnd"/>
-      <w:r>
-        <w:rPr>
-          <w:strike/>
-        </w:rPr>
-        <w:t xml:space="preserve"> now u know</w:t>
+        <w:t>api_client.py: Possibly add more exceptions to detect specific error in case of errors being encountered or something and then printing in terminal or whatever or however the logging is being done to make life easy for the next developer or a mix of technical and non-technical person too</w:t>
       </w:r>
     </w:p>
     <w:p>
@@ -321,8 +371,6 @@
           <w:numId w:val="3"/>
         </w:numPr>
         <w:rPr>
-          <w:b/>
-          <w:bCs/>
           <w:strike/>
           <w:sz w:val="32"/>
           <w:szCs w:val="32"/>
@@ -333,21 +381,35 @@
         <w:rPr>
           <w:strike/>
         </w:rPr>
-        <w:t xml:space="preserve">Solve AFC error being shown in terminal for the </w:t>
-      </w:r>
-      <w:proofErr w:type="spellStart"/>
-      <w:r>
-        <w:rPr>
-          <w:strike/>
-        </w:rPr>
-        <w:t>gemini</w:t>
-      </w:r>
-      <w:proofErr w:type="spellEnd"/>
-      <w:r>
-        <w:rPr>
-          <w:strike/>
-        </w:rPr>
-        <w:t xml:space="preserve"> thingy or something</w:t>
+        <w:t xml:space="preserve">Rather than utilizing composite scoring in scoring.py how about utilizing some complex finance related formula or finance industry related formula to first show that I have the domain knowledge for which this product is given for secondly also have </w:t>
+      </w:r>
+      <w:proofErr w:type="spellStart"/>
+      <w:r>
+        <w:rPr>
+          <w:strike/>
+        </w:rPr>
+        <w:t>kinda</w:t>
+      </w:r>
+      <w:proofErr w:type="spellEnd"/>
+      <w:r>
+        <w:rPr>
+          <w:strike/>
+        </w:rPr>
+        <w:t xml:space="preserve"> like a more deterministic and confirmed score like using some approach that’s always been used </w:t>
+      </w:r>
+      <w:proofErr w:type="spellStart"/>
+      <w:r>
+        <w:rPr>
+          <w:strike/>
+        </w:rPr>
+        <w:t>uptill</w:t>
+      </w:r>
+      <w:proofErr w:type="spellEnd"/>
+      <w:r>
+        <w:rPr>
+          <w:strike/>
+        </w:rPr>
+        <w:t xml:space="preserve"> now u know</w:t>
       </w:r>
     </w:p>
     <w:p>
@@ -358,90 +420,33 @@
           <w:numId w:val="3"/>
         </w:numPr>
         <w:rPr>
-          <w:strike/>
-        </w:rPr>
-      </w:pPr>
-      <w:r>
-        <w:rPr>
-          <w:strike/>
-        </w:rPr>
-        <w:t xml:space="preserve">Rather than fetching only one file related to </w:t>
-      </w:r>
-      <w:proofErr w:type="spellStart"/>
-      <w:r>
-        <w:rPr>
-          <w:strike/>
-        </w:rPr>
-        <w:t>coinbase</w:t>
-      </w:r>
-      <w:proofErr w:type="spellEnd"/>
-      <w:r>
-        <w:rPr>
-          <w:strike/>
-        </w:rPr>
-        <w:t xml:space="preserve"> how about finding a AWS bucket or GCS (google) bucket which has a bunch of docs like this </w:t>
-      </w:r>
-      <w:proofErr w:type="spellStart"/>
-      <w:r>
-        <w:rPr>
-          <w:strike/>
-        </w:rPr>
-        <w:t>cuz</w:t>
-      </w:r>
-      <w:proofErr w:type="spellEnd"/>
-      <w:r>
-        <w:rPr>
-          <w:strike/>
-        </w:rPr>
-        <w:t xml:space="preserve"> I believe in case of audits there could be like a single company applicant having various applications in various sectors let’s say financial, digital infrastructure, governmental contracts and so on (if this is actually the case or not feel free to disagree on this if I’m wrong)</w:t>
-      </w:r>
-    </w:p>
-    <w:p>
-      <w:pPr>
-        <w:pStyle w:val="ListParagraph"/>
-        <w:numPr>
-          <w:ilvl w:val="0"/>
-          <w:numId w:val="3"/>
-        </w:numPr>
-        <w:rPr>
-          <w:b/>
-          <w:bCs/>
+          <w:b/>
+          <w:bCs/>
+          <w:strike/>
           <w:sz w:val="32"/>
           <w:szCs w:val="32"/>
           <w:u w:val="single"/>
         </w:rPr>
       </w:pPr>
       <w:r>
-        <w:t xml:space="preserve">api_client.py: Rather than only posting to a simple </w:t>
-      </w:r>
-      <w:proofErr w:type="spellStart"/>
-      <w:r>
-        <w:t>httpbin</w:t>
-      </w:r>
-      <w:proofErr w:type="spellEnd"/>
-      <w:r>
-        <w:t xml:space="preserve"> URL how about some other site or </w:t>
-      </w:r>
-      <w:proofErr w:type="spellStart"/>
-      <w:r>
-        <w:t>httpbin</w:t>
-      </w:r>
-      <w:proofErr w:type="spellEnd"/>
-      <w:r>
-        <w:t xml:space="preserve"> only or something with a UI where it gets posted and actually allows the reviewer to review it and the make a decision or whatever the project scope mentions etc.</w:t>
-      </w:r>
-      <w:r>
-        <w:t xml:space="preserve"> (this is also because the specification mentions that the structured payload should be suitable for </w:t>
-      </w:r>
-      <w:r>
-        <w:rPr>
-          <w:b/>
-          <w:bCs/>
-        </w:rPr>
-        <w:t>reviewer validation and override</w:t>
-      </w:r>
-      <w:r>
-        <w:t xml:space="preserve"> hence I believe that there should be a approve or reject or edit and take over option inside the UI possibly?</w:t>
+        <w:rPr>
+          <w:strike/>
+        </w:rPr>
+        <w:t xml:space="preserve">Solve AFC error being shown in terminal for the </w:t>
+      </w:r>
+      <w:proofErr w:type="spellStart"/>
+      <w:r>
+        <w:rPr>
+          <w:strike/>
+        </w:rPr>
+        <w:t>gemini</w:t>
+      </w:r>
+      <w:proofErr w:type="spellEnd"/>
+      <w:r>
+        <w:rPr>
+          <w:strike/>
+        </w:rPr>
+        <w:t xml:space="preserve"> thingy or something</w:t>
       </w:r>
     </w:p>
     <w:p>
@@ -452,29 +457,324 @@
           <w:numId w:val="3"/>
         </w:numPr>
         <w:rPr>
-          <w:b/>
-          <w:bCs/>
+          <w:strike/>
+        </w:rPr>
+      </w:pPr>
+      <w:r>
+        <w:rPr>
+          <w:strike/>
+        </w:rPr>
+        <w:t xml:space="preserve">Rather than fetching only one file related to </w:t>
+      </w:r>
+      <w:proofErr w:type="spellStart"/>
+      <w:r>
+        <w:rPr>
+          <w:strike/>
+        </w:rPr>
+        <w:t>coinbase</w:t>
+      </w:r>
+      <w:proofErr w:type="spellEnd"/>
+      <w:r>
+        <w:rPr>
+          <w:strike/>
+        </w:rPr>
+        <w:t xml:space="preserve"> how about finding a AWS bucket or GCS (google) bucket which has a bunch of docs like this </w:t>
+      </w:r>
+      <w:proofErr w:type="spellStart"/>
+      <w:r>
+        <w:rPr>
+          <w:strike/>
+        </w:rPr>
+        <w:t>cuz</w:t>
+      </w:r>
+      <w:proofErr w:type="spellEnd"/>
+      <w:r>
+        <w:rPr>
+          <w:strike/>
+        </w:rPr>
+        <w:t xml:space="preserve"> I believe in case of audits there could be like a single company applicant having various applications in various sectors let’s say financial, digital infrastructure, governmental contracts and so on (if this is actually the case or not feel free to disagree on this if I’m wrong)</w:t>
+      </w:r>
+    </w:p>
+    <w:p>
+      <w:pPr>
+        <w:pStyle w:val="ListParagraph"/>
+        <w:numPr>
+          <w:ilvl w:val="0"/>
+          <w:numId w:val="3"/>
+        </w:numPr>
+        <w:rPr>
+          <w:strike/>
+          <w:sz w:val="32"/>
+          <w:szCs w:val="32"/>
+        </w:rPr>
+      </w:pPr>
+      <w:r>
+        <w:rPr>
+          <w:strike/>
+        </w:rPr>
+        <w:t xml:space="preserve">Possible to ask LLM for further extraction or possibly refining the extraction of key </w:t>
+      </w:r>
+      <w:proofErr w:type="spellStart"/>
+      <w:r>
+        <w:rPr>
+          <w:strike/>
+        </w:rPr>
+        <w:t>infos</w:t>
+      </w:r>
+      <w:proofErr w:type="spellEnd"/>
+      <w:r>
+        <w:rPr>
+          <w:strike/>
+        </w:rPr>
+        <w:t xml:space="preserve"> like Dimensions, Risk Level, Evidence already being extracted so how about anything else as well perhaps that could be more helpful and make pipeline much better and useful while sticking to </w:t>
+      </w:r>
+      <w:r>
+        <w:rPr>
+          <w:strike/>
+        </w:rPr>
+        <w:lastRenderedPageBreak/>
+        <w:t>the project specification. (do research on this for some other sample pipelines or systems similar to this perhaps).</w:t>
+      </w:r>
+    </w:p>
+    <w:p>
+      <w:pPr>
+        <w:pStyle w:val="ListParagraph"/>
+        <w:numPr>
+          <w:ilvl w:val="0"/>
+          <w:numId w:val="3"/>
+        </w:numPr>
+        <w:rPr>
+          <w:strike/>
+        </w:rPr>
+      </w:pPr>
+      <w:r>
+        <w:rPr>
+          <w:strike/>
+        </w:rPr>
+        <w:t>Possibly having a bit flexible applicant metadata of some form or something since dealing with different organizations perhaps or something?</w:t>
+      </w:r>
+    </w:p>
+    <w:p>
+      <w:pPr>
+        <w:pStyle w:val="ListParagraph"/>
+        <w:numPr>
+          <w:ilvl w:val="0"/>
+          <w:numId w:val="3"/>
+        </w:numPr>
+        <w:rPr>
+          <w:strike/>
+        </w:rPr>
+      </w:pPr>
+      <w:r>
+        <w:rPr>
+          <w:b/>
+          <w:bCs/>
+          <w:i/>
+          <w:iCs/>
+          <w:strike/>
+        </w:rPr>
+        <w:t>Parser.py</w:t>
+      </w:r>
+      <w:r>
+        <w:rPr>
+          <w:strike/>
+        </w:rPr>
+        <w:t xml:space="preserve">: </w:t>
+      </w:r>
+      <w:r>
+        <w:rPr>
+          <w:strike/>
+        </w:rPr>
+        <w:t>if not matches:</w:t>
+      </w:r>
+      <w:r>
+        <w:rPr>
+          <w:strike/>
+        </w:rPr>
+        <w:t xml:space="preserve"> </w:t>
+      </w:r>
+    </w:p>
+    <w:p>
+      <w:pPr>
+        <w:pStyle w:val="ListParagraph"/>
+        <w:rPr>
+          <w:strike/>
+        </w:rPr>
+      </w:pPr>
+      <w:r>
+        <w:rPr>
+          <w:strike/>
+        </w:rPr>
+        <w:t xml:space="preserve">            </w:t>
+      </w:r>
+      <w:proofErr w:type="spellStart"/>
+      <w:proofErr w:type="gramStart"/>
+      <w:r>
+        <w:rPr>
+          <w:strike/>
+        </w:rPr>
+        <w:t>logger.warning</w:t>
+      </w:r>
+      <w:proofErr w:type="spellEnd"/>
+      <w:proofErr w:type="gramEnd"/>
+      <w:r>
+        <w:rPr>
+          <w:strike/>
+        </w:rPr>
+        <w:t>("Regex failed to find Item 1A and 1B markers. Falling back to naive chunking.")</w:t>
+      </w:r>
+    </w:p>
+    <w:p>
+      <w:pPr>
+        <w:pStyle w:val="ListParagraph"/>
+        <w:rPr>
+          <w:strike/>
+        </w:rPr>
+      </w:pPr>
+      <w:r>
+        <w:rPr>
+          <w:strike/>
+        </w:rPr>
+        <w:t>            # Fallback: Just return the first 20,000 characters if regex fails</w:t>
+      </w:r>
+    </w:p>
+    <w:p>
+      <w:pPr>
+        <w:pStyle w:val="ListParagraph"/>
+        <w:rPr>
+          <w:strike/>
+        </w:rPr>
+      </w:pPr>
+      <w:r>
+        <w:rPr>
+          <w:strike/>
+        </w:rPr>
+        <w:t xml:space="preserve">            return </w:t>
+      </w:r>
+      <w:proofErr w:type="gramStart"/>
+      <w:r>
+        <w:rPr>
+          <w:strike/>
+        </w:rPr>
+        <w:t>text[</w:t>
+      </w:r>
+      <w:proofErr w:type="gramEnd"/>
+      <w:r>
+        <w:rPr>
+          <w:strike/>
+        </w:rPr>
+        <w:t>:20000]</w:t>
+      </w:r>
+    </w:p>
+    <w:p>
+      <w:pPr>
+        <w:pStyle w:val="ListParagraph"/>
+        <w:rPr>
+          <w:strike/>
+        </w:rPr>
+      </w:pPr>
+    </w:p>
+    <w:p>
+      <w:pPr>
+        <w:pStyle w:val="ListParagraph"/>
+        <w:rPr>
+          <w:strike/>
+        </w:rPr>
+      </w:pPr>
+      <w:r>
+        <w:rPr>
+          <w:strike/>
+        </w:rPr>
+        <w:t xml:space="preserve">^^^^ (how about not falling back to naïve chunking and simply outputting </w:t>
+      </w:r>
+      <w:proofErr w:type="spellStart"/>
+      <w:proofErr w:type="gramStart"/>
+      <w:r>
+        <w:rPr>
+          <w:strike/>
+        </w:rPr>
+        <w:t>a</w:t>
+      </w:r>
+      <w:proofErr w:type="spellEnd"/>
+      <w:proofErr w:type="gramEnd"/>
+      <w:r>
+        <w:rPr>
+          <w:strike/>
+        </w:rPr>
+        <w:t xml:space="preserve"> error and flagging this for further review than wasting LLM tokens and resources unnecessarily and passing it further down pipeline causing more errors later on for the human reviewer)</w:t>
+      </w:r>
+    </w:p>
+    <w:p>
+      <w:pPr>
+        <w:pStyle w:val="ListParagraph"/>
+        <w:numPr>
+          <w:ilvl w:val="0"/>
+          <w:numId w:val="3"/>
+        </w:numPr>
+        <w:rPr>
+          <w:b/>
+          <w:bCs/>
+          <w:strike/>
           <w:sz w:val="32"/>
           <w:szCs w:val="32"/>
           <w:u w:val="single"/>
         </w:rPr>
       </w:pPr>
-      <w:r>
-        <w:t xml:space="preserve">Possible to ask LLM for further extraction or possibly refining the extraction of key </w:t>
-      </w:r>
-      <w:proofErr w:type="spellStart"/>
-      <w:r>
-        <w:t>infos</w:t>
-      </w:r>
-      <w:proofErr w:type="spellEnd"/>
-      <w:r>
-        <w:t xml:space="preserve"> like Dimensions, Risk Level, Evidence already being extracted so how about anything else as well perhaps that could be more helpful and make pipeline much better and useful while sticking to </w:t>
-      </w:r>
-      <w:r>
-        <w:lastRenderedPageBreak/>
-        <w:t>the project specification. (do research on this for some other sample pipelines or systems similar to this perhaps).</w:t>
-      </w:r>
-    </w:p>
+      <w:bookmarkStart w:id="0" w:name="_GoBack"/>
+      <w:r>
+        <w:rPr>
+          <w:b/>
+          <w:bCs/>
+          <w:strike/>
+        </w:rPr>
+        <w:t xml:space="preserve">api_client.py: Rather than only posting to a simple </w:t>
+      </w:r>
+      <w:proofErr w:type="spellStart"/>
+      <w:r>
+        <w:rPr>
+          <w:b/>
+          <w:bCs/>
+          <w:strike/>
+        </w:rPr>
+        <w:t>httpbin</w:t>
+      </w:r>
+      <w:proofErr w:type="spellEnd"/>
+      <w:r>
+        <w:rPr>
+          <w:b/>
+          <w:bCs/>
+          <w:strike/>
+        </w:rPr>
+        <w:t xml:space="preserve"> URL how about some other site or </w:t>
+      </w:r>
+      <w:proofErr w:type="spellStart"/>
+      <w:r>
+        <w:rPr>
+          <w:b/>
+          <w:bCs/>
+          <w:strike/>
+        </w:rPr>
+        <w:t>httpbin</w:t>
+      </w:r>
+      <w:proofErr w:type="spellEnd"/>
+      <w:r>
+        <w:rPr>
+          <w:b/>
+          <w:bCs/>
+          <w:strike/>
+        </w:rPr>
+        <w:t xml:space="preserve"> only or something with a UI where it gets posted and actually allows the reviewer to review it and the make a decision or whatever the project scope mentions etc.</w:t>
+      </w:r>
+      <w:r>
+        <w:rPr>
+          <w:b/>
+          <w:bCs/>
+          <w:strike/>
+        </w:rPr>
+        <w:t xml:space="preserve"> (this is also because the specification mentions that the structured payload should be suitable for reviewer validation and override hence I believe that there should be a approve or reject or edit and take over option inside the UI possibly?</w:t>
+      </w:r>
+    </w:p>
+    <w:bookmarkEnd w:id="0"/>
     <w:p>
       <w:pPr>
         <w:pStyle w:val="ListParagraph"/>
@@ -485,26 +785,37 @@
         <w:rPr>
           <w:b/>
           <w:bCs/>
+          <w:strike/>
           <w:sz w:val="32"/>
           <w:szCs w:val="32"/>
           <w:u w:val="single"/>
         </w:rPr>
       </w:pPr>
       <w:r>
+        <w:rPr>
+          <w:strike/>
+        </w:rPr>
         <w:t xml:space="preserve">Should this pipeline be given a UI which shows everything or not since by giving the UI it could help to present to the normal non-technical stakeholders too how it works </w:t>
       </w:r>
       <w:proofErr w:type="spellStart"/>
       <w:r>
+        <w:rPr>
+          <w:strike/>
+        </w:rPr>
         <w:t>etc</w:t>
       </w:r>
       <w:proofErr w:type="spellEnd"/>
       <w:r>
+        <w:rPr>
+          <w:strike/>
+        </w:rPr>
         <w:t xml:space="preserve"> rather than just the technical stakeholders possibly and also UI in such a way that the backend still exists and visible easily </w:t>
       </w:r>
       <w:r>
         <w:rPr>
           <w:b/>
           <w:bCs/>
+          <w:strike/>
         </w:rPr>
         <w:t xml:space="preserve">BUT NOT SURE NEED TO CONFIRM IF </w:t>
       </w:r>
@@ -512,10 +823,14 @@
         <w:rPr>
           <w:b/>
           <w:bCs/>
+          <w:strike/>
         </w:rPr>
         <w:t>SUITABLE FOR PIPELINE OR NOT</w:t>
       </w:r>
       <w:r>
+        <w:rPr>
+          <w:strike/>
+        </w:rPr>
         <w:t xml:space="preserve"> as we’re already using docker so like can contain all this in a container like packaged in a way</w:t>
       </w:r>
     </w:p>
@@ -529,20 +844,30 @@
         <w:rPr>
           <w:b/>
           <w:bCs/>
+          <w:strike/>
           <w:sz w:val="32"/>
           <w:szCs w:val="32"/>
           <w:u w:val="single"/>
         </w:rPr>
       </w:pPr>
       <w:r>
+        <w:rPr>
+          <w:strike/>
+        </w:rPr>
         <w:t xml:space="preserve">For the API reviewer endpoint possibly get like UI for that if </w:t>
       </w:r>
       <w:proofErr w:type="gramStart"/>
       <w:r>
+        <w:rPr>
+          <w:strike/>
+        </w:rPr>
         <w:t>possible</w:t>
       </w:r>
       <w:proofErr w:type="gramEnd"/>
       <w:r>
+        <w:rPr>
+          <w:strike/>
+        </w:rPr>
         <w:t xml:space="preserve"> this would again help in this case for both the non-technical audience and technical audience to understand it</w:t>
       </w:r>
     </w:p>
@@ -586,125 +911,26 @@
           <w:ilvl w:val="0"/>
           <w:numId w:val="3"/>
         </w:numPr>
-      </w:pPr>
-      <w:r>
-        <w:t>Possibly having a bit flexible applicant metadata of some form or something since dealing with different organizations perhaps or something?</w:t>
-      </w:r>
-    </w:p>
-    <w:p>
-      <w:pPr>
-        <w:pStyle w:val="ListParagraph"/>
-        <w:numPr>
-          <w:ilvl w:val="0"/>
-          <w:numId w:val="3"/>
-        </w:numPr>
-      </w:pPr>
-      <w:r>
-        <w:rPr>
-          <w:b/>
-          <w:bCs/>
-          <w:i/>
-          <w:iCs/>
-        </w:rPr>
-        <w:t>Parser.py</w:t>
-      </w:r>
-      <w:r>
-        <w:t xml:space="preserve">: </w:t>
-      </w:r>
-      <w:r>
-        <w:t>if not matches:</w:t>
-      </w:r>
-      <w:r>
-        <w:t xml:space="preserve"> </w:t>
-      </w:r>
-    </w:p>
-    <w:p>
-      <w:pPr>
-        <w:pStyle w:val="ListParagraph"/>
-      </w:pPr>
-      <w:r>
-        <w:t xml:space="preserve">            </w:t>
-      </w:r>
-      <w:proofErr w:type="spellStart"/>
-      <w:proofErr w:type="gramStart"/>
-      <w:r>
-        <w:t>logger.warning</w:t>
-      </w:r>
-      <w:proofErr w:type="spellEnd"/>
-      <w:proofErr w:type="gramEnd"/>
-      <w:r>
-        <w:t>("Regex failed to find Item 1A and 1B markers. Falling back to naive chunking.")</w:t>
-      </w:r>
-    </w:p>
-    <w:p>
-      <w:pPr>
-        <w:pStyle w:val="ListParagraph"/>
-      </w:pPr>
-      <w:r>
-        <w:t>            # Fallback: Just return the first 20,000 characters if regex fails</w:t>
-      </w:r>
-    </w:p>
-    <w:p>
-      <w:pPr>
-        <w:pStyle w:val="ListParagraph"/>
-      </w:pPr>
-      <w:r>
-        <w:t xml:space="preserve">            return </w:t>
-      </w:r>
-      <w:proofErr w:type="gramStart"/>
-      <w:r>
-        <w:t>text[</w:t>
-      </w:r>
-      <w:proofErr w:type="gramEnd"/>
-      <w:r>
-        <w:t>:20000]</w:t>
-      </w:r>
-    </w:p>
-    <w:p>
-      <w:pPr>
-        <w:pStyle w:val="ListParagraph"/>
-      </w:pPr>
-    </w:p>
-    <w:p>
-      <w:pPr>
-        <w:pStyle w:val="ListParagraph"/>
-      </w:pPr>
-      <w:r>
-        <w:t xml:space="preserve">^^^^ (how about not falling back to naïve chunking and simply outputting </w:t>
-      </w:r>
-      <w:proofErr w:type="gramStart"/>
-      <w:r>
-        <w:t>a</w:t>
-      </w:r>
-      <w:proofErr w:type="gramEnd"/>
-      <w:r>
-        <w:t xml:space="preserve"> error and flagging this for further review than wasting LLM tokens and resources unnecessarily and passing it further down pipeline causing more errors later on for the human reviewer)</w:t>
-      </w:r>
-    </w:p>
-    <w:p>
-      <w:pPr>
-        <w:pStyle w:val="ListParagraph"/>
-        <w:numPr>
-          <w:ilvl w:val="0"/>
-          <w:numId w:val="3"/>
-        </w:numPr>
-        <w:rPr>
-          <w:i/>
-          <w:iCs/>
-        </w:rPr>
-      </w:pPr>
-      <w:r>
-        <w:rPr>
-          <w:b/>
-          <w:bCs/>
-          <w:i/>
-          <w:iCs/>
+        <w:rPr>
+          <w:i/>
+          <w:iCs/>
+          <w:strike/>
+        </w:rPr>
+      </w:pPr>
+      <w:r>
+        <w:rPr>
+          <w:b/>
+          <w:bCs/>
+          <w:i/>
+          <w:iCs/>
+          <w:strike/>
         </w:rPr>
         <w:t>Parser.py:</w:t>
       </w:r>
       <w:r>
         <w:rPr>
           <w:rFonts w:ascii="Consolas" w:eastAsia="Times New Roman" w:hAnsi="Consolas" w:cs="Times New Roman"/>
+          <w:strike/>
           <w:color w:val="D4D4D4"/>
           <w:sz w:val="21"/>
           <w:szCs w:val="21"/>
@@ -716,6 +942,7 @@
         <w:rPr>
           <w:i/>
           <w:iCs/>
+          <w:strike/>
         </w:rPr>
         <w:t>max_chars</w:t>
       </w:r>
@@ -724,6 +951,7 @@
         <w:rPr>
           <w:i/>
           <w:iCs/>
+          <w:strike/>
         </w:rPr>
         <w:t xml:space="preserve"> = 60000 </w:t>
       </w:r>
@@ -734,12 +962,14 @@
         <w:rPr>
           <w:i/>
           <w:iCs/>
-        </w:rPr>
-      </w:pPr>
-      <w:r>
-        <w:rPr>
-          <w:i/>
-          <w:iCs/>
+          <w:strike/>
+        </w:rPr>
+      </w:pPr>
+      <w:r>
+        <w:rPr>
+          <w:i/>
+          <w:iCs/>
+          <w:strike/>
         </w:rPr>
         <w:t xml:space="preserve">       if </w:t>
       </w:r>
@@ -748,6 +978,7 @@
         <w:rPr>
           <w:i/>
           <w:iCs/>
+          <w:strike/>
         </w:rPr>
         <w:t>len</w:t>
       </w:r>
@@ -756,6 +987,7 @@
         <w:rPr>
           <w:i/>
           <w:iCs/>
+          <w:strike/>
         </w:rPr>
         <w:t>(</w:t>
       </w:r>
@@ -764,6 +996,7 @@
         <w:rPr>
           <w:i/>
           <w:iCs/>
+          <w:strike/>
         </w:rPr>
         <w:t>extracted_text</w:t>
       </w:r>
@@ -772,6 +1005,7 @@
         <w:rPr>
           <w:i/>
           <w:iCs/>
+          <w:strike/>
         </w:rPr>
         <w:t xml:space="preserve">) &gt; </w:t>
       </w:r>
@@ -780,6 +1014,7 @@
         <w:rPr>
           <w:i/>
           <w:iCs/>
+          <w:strike/>
         </w:rPr>
         <w:t>max_chars</w:t>
       </w:r>
@@ -788,6 +1023,7 @@
         <w:rPr>
           <w:i/>
           <w:iCs/>
+          <w:strike/>
         </w:rPr>
         <w:t>:</w:t>
       </w:r>
@@ -798,12 +1034,14 @@
         <w:rPr>
           <w:i/>
           <w:iCs/>
-        </w:rPr>
-      </w:pPr>
-      <w:r>
-        <w:rPr>
-          <w:i/>
-          <w:iCs/>
+          <w:strike/>
+        </w:rPr>
+      </w:pPr>
+      <w:r>
+        <w:rPr>
+          <w:i/>
+          <w:iCs/>
+          <w:strike/>
         </w:rPr>
         <w:t xml:space="preserve">            </w:t>
       </w:r>
@@ -812,6 +1050,7 @@
         <w:rPr>
           <w:i/>
           <w:iCs/>
+          <w:strike/>
         </w:rPr>
         <w:t>logger.info(</w:t>
       </w:r>
@@ -821,6 +1060,7 @@
         <w:rPr>
           <w:i/>
           <w:iCs/>
+          <w:strike/>
         </w:rPr>
         <w:t>f"Truncating</w:t>
       </w:r>
@@ -829,6 +1069,7 @@
         <w:rPr>
           <w:i/>
           <w:iCs/>
+          <w:strike/>
         </w:rPr>
         <w:t xml:space="preserve"> extraction from {</w:t>
       </w:r>
@@ -837,6 +1078,7 @@
         <w:rPr>
           <w:i/>
           <w:iCs/>
+          <w:strike/>
         </w:rPr>
         <w:t>len</w:t>
       </w:r>
@@ -845,6 +1087,7 @@
         <w:rPr>
           <w:i/>
           <w:iCs/>
+          <w:strike/>
         </w:rPr>
         <w:t>(</w:t>
       </w:r>
@@ -853,6 +1096,7 @@
         <w:rPr>
           <w:i/>
           <w:iCs/>
+          <w:strike/>
         </w:rPr>
         <w:t>extracted_text</w:t>
       </w:r>
@@ -861,6 +1105,7 @@
         <w:rPr>
           <w:i/>
           <w:iCs/>
+          <w:strike/>
         </w:rPr>
         <w:t>)} to {</w:t>
       </w:r>
@@ -869,6 +1114,7 @@
         <w:rPr>
           <w:i/>
           <w:iCs/>
+          <w:strike/>
         </w:rPr>
         <w:t>max_chars</w:t>
       </w:r>
@@ -877,6 +1123,7 @@
         <w:rPr>
           <w:i/>
           <w:iCs/>
+          <w:strike/>
         </w:rPr>
         <w:t>} characters for token efficiency.")</w:t>
       </w:r>
@@ -887,12 +1134,14 @@
         <w:rPr>
           <w:i/>
           <w:iCs/>
-        </w:rPr>
-      </w:pPr>
-      <w:r>
-        <w:rPr>
-          <w:i/>
-          <w:iCs/>
+          <w:strike/>
+        </w:rPr>
+      </w:pPr>
+      <w:r>
+        <w:rPr>
+          <w:i/>
+          <w:iCs/>
+          <w:strike/>
         </w:rPr>
         <w:t xml:space="preserve">            </w:t>
       </w:r>
@@ -901,6 +1150,7 @@
         <w:rPr>
           <w:i/>
           <w:iCs/>
+          <w:strike/>
         </w:rPr>
         <w:t>extracted_text</w:t>
       </w:r>
@@ -909,6 +1159,7 @@
         <w:rPr>
           <w:i/>
           <w:iCs/>
+          <w:strike/>
         </w:rPr>
         <w:t xml:space="preserve"> = </w:t>
       </w:r>
@@ -917,6 +1168,7 @@
         <w:rPr>
           <w:i/>
           <w:iCs/>
+          <w:strike/>
         </w:rPr>
         <w:t>extracted_text</w:t>
       </w:r>
@@ -925,6 +1177,7 @@
         <w:rPr>
           <w:i/>
           <w:iCs/>
+          <w:strike/>
         </w:rPr>
         <w:t>[:</w:t>
       </w:r>
@@ -933,6 +1186,7 @@
         <w:rPr>
           <w:i/>
           <w:iCs/>
+          <w:strike/>
         </w:rPr>
         <w:t>max_chars</w:t>
       </w:r>
@@ -941,6 +1195,7 @@
         <w:rPr>
           <w:i/>
           <w:iCs/>
+          <w:strike/>
         </w:rPr>
         <w:t>]</w:t>
       </w:r>
@@ -951,12 +1206,14 @@
         <w:rPr>
           <w:i/>
           <w:iCs/>
-        </w:rPr>
-      </w:pPr>
-      <w:r>
-        <w:rPr>
-          <w:i/>
-          <w:iCs/>
+          <w:strike/>
+        </w:rPr>
+      </w:pPr>
+      <w:r>
+        <w:rPr>
+          <w:i/>
+          <w:iCs/>
+          <w:strike/>
         </w:rPr>
         <w:t xml:space="preserve">            </w:t>
       </w:r>
@@ -967,12 +1224,14 @@
         <w:rPr>
           <w:i/>
           <w:iCs/>
-        </w:rPr>
-      </w:pPr>
-      <w:r>
-        <w:rPr>
-          <w:i/>
-          <w:iCs/>
+          <w:strike/>
+        </w:rPr>
+      </w:pPr>
+      <w:r>
+        <w:rPr>
+          <w:i/>
+          <w:iCs/>
+          <w:strike/>
         </w:rPr>
         <w:t xml:space="preserve">        return </w:t>
       </w:r>
@@ -981,6 +1240,7 @@
         <w:rPr>
           <w:i/>
           <w:iCs/>
+          <w:strike/>
         </w:rPr>
         <w:t>extracted_text</w:t>
       </w:r>
@@ -989,57 +1249,97 @@
     <w:p>
       <w:pPr>
         <w:pStyle w:val="ListParagraph"/>
-      </w:pPr>
-      <w:r>
+        <w:rPr>
+          <w:strike/>
+        </w:rPr>
+      </w:pPr>
+      <w:r>
+        <w:rPr>
+          <w:strike/>
+        </w:rPr>
         <w:t xml:space="preserve">^^^ (If we’re just truncating randomly this could risk leaving out important details no? so how about using semantic ranking technique like TF-IDF or BN25 or something like that not </w:t>
       </w:r>
       <w:proofErr w:type="spellStart"/>
       <w:r>
+        <w:rPr>
+          <w:strike/>
+        </w:rPr>
         <w:t>suer</w:t>
       </w:r>
       <w:proofErr w:type="spellEnd"/>
       <w:r>
-        <w:t xml:space="preserve"> if they are applicable in our case but something like that allowing us to rank whole sentences or just select most heavy or u know context heavy words from the sentences and then ranking the whole sentences accordingly to get the most context in hence allowing earlier truncation as well making the pipeline more efficient this way as well as also leaving out the possibility of leaving out info through random truncation) (ALSO configure like check what context window our current model operates on and secondly if it’s a static context window or a dynamic window and then accordingly set the truncation size if we still need to truncate.)</w:t>
-      </w:r>
-    </w:p>
-    <w:p>
-      <w:pPr>
-        <w:pStyle w:val="ListParagraph"/>
-      </w:pPr>
-      <w:r>
+        <w:rPr>
+          <w:strike/>
+        </w:rPr>
+        <w:t xml:space="preserve"> if they are applicable in our case but something like that allowing us to rank whole sentences or just select most heavy or u know context heavy words from the sentences and then ranking the whole sentences accordingly to get the most context in hence allowing earlier truncation as well making the pipeline more efficient this way as well as also leaving out the possibility of leaving out info through random truncation) (ALSO configure like check what context window our </w:t>
+      </w:r>
+      <w:r>
+        <w:rPr>
+          <w:strike/>
+        </w:rPr>
+        <w:lastRenderedPageBreak/>
+        <w:t>current model operates on and secondly if it’s a static context window or a dynamic window and then accordingly set the truncation size if we still need to truncate.)</w:t>
+      </w:r>
+    </w:p>
+    <w:p>
+      <w:pPr>
+        <w:pStyle w:val="ListParagraph"/>
+        <w:rPr>
+          <w:strike/>
+        </w:rPr>
+      </w:pPr>
+      <w:r>
+        <w:rPr>
+          <w:strike/>
+        </w:rPr>
         <w:t xml:space="preserve"> </w:t>
       </w:r>
     </w:p>
     <w:p>
       <w:pPr>
         <w:pStyle w:val="ListParagraph"/>
-      </w:pPr>
-      <w:r>
-        <w:t xml:space="preserve">^^^^ Another Idea for this: Another idea is that in case the text is extremely long then how about taking a efficient approach for this where the less complex things can be provided to a far cheaper LLM model that takes up less cost and the complex or the end high level decisions with the relevant context can be provide to a LLM which can  take up less cost but will only be </w:t>
-      </w:r>
-      <w:r>
-        <w:lastRenderedPageBreak/>
-        <w:t>reasoning rather than inferring as well which the cheaper LLM already does hence overall technically should spend less resources on LLM</w:t>
-      </w:r>
-      <w:r>
+        <w:rPr>
+          <w:strike/>
+        </w:rPr>
+      </w:pPr>
+      <w:r>
+        <w:rPr>
+          <w:strike/>
+        </w:rPr>
+        <w:t>^^^^ Another Idea for this: Another idea is that in case the text is extremely long then how about taking a efficient approach for this where the less complex things can be provided to a far cheaper LLM model that takes up less cost and the complex or the end high level decisions with the relevant context can be provide to a LLM which can  take up less cost but will only be reasoning rather than inferring as well which the cheaper LLM already does hence overall technically should spend less resources on LLM</w:t>
+      </w:r>
+      <w:r>
+        <w:rPr>
+          <w:strike/>
+        </w:rPr>
         <w:t xml:space="preserve"> </w:t>
       </w:r>
       <w:r>
         <w:rPr>
           <w:b/>
           <w:bCs/>
+          <w:strike/>
         </w:rPr>
         <w:t>HOWEVER</w:t>
       </w:r>
       <w:r>
+        <w:rPr>
+          <w:strike/>
+        </w:rPr>
         <w:t xml:space="preserve"> we need to remain within the constraint of a fixed execution limit so need to keep that in mind when still deciding on how much time we’re taking specially to process the initial text and the semantically ranked text or something the way we’re </w:t>
       </w:r>
       <w:proofErr w:type="spellStart"/>
       <w:r>
+        <w:rPr>
+          <w:strike/>
+        </w:rPr>
         <w:t>gonna</w:t>
       </w:r>
       <w:proofErr w:type="spellEnd"/>
       <w:r>
+        <w:rPr>
+          <w:strike/>
+        </w:rPr>
         <w:t xml:space="preserve"> be proceeding basically)</w:t>
       </w:r>
     </w:p>
@@ -1311,6 +1611,7 @@
         </w:numPr>
       </w:pPr>
       <w:r>
+        <w:lastRenderedPageBreak/>
         <w:t xml:space="preserve">Performance </w:t>
       </w:r>
       <w:proofErr w:type="spellStart"/>
@@ -1363,7 +1664,6 @@
         </w:numPr>
       </w:pPr>
       <w:r>
-        <w:lastRenderedPageBreak/>
         <w:t xml:space="preserve">Evaluation Methods: using offline test datasets for baseline scores, human-in-the-loop (HITL) reviews for </w:t>
       </w:r>
       <w:r>
@@ -1733,6 +2033,7 @@
         <w:spacing w:before="240"/>
       </w:pPr>
       <w:r>
+        <w:lastRenderedPageBreak/>
         <w:t>Mathematical composite score i.e. a weighted average to keep final score explainable.</w:t>
       </w:r>
     </w:p>
@@ -1772,7 +2073,6 @@
         <w:spacing w:before="240"/>
       </w:pPr>
       <w:r>
-        <w:lastRenderedPageBreak/>
         <w:t>In case of missing info or contradicting info from JSON with the documents, follow-up questions asked from applicant.</w:t>
       </w:r>
     </w:p>

</xml_diff>